<commit_message>
Build Chapter 1 gold-standard slideshow and sync playbook
</commit_message>
<xml_diff>
--- a/production/teacher-playbook/unit1-teacher-playbook.docx
+++ b/production/teacher-playbook/unit1-teacher-playbook.docx
@@ -14952,7 +14952,7 @@
                 <w:color w:val="4A5268"/>
                 <w:sz w:val="18"/>
               </w:rPr>
-              <w:t>Slide deck — PLANNED Phase 4 (BQ banner · demo BEFORE/AFTER · vocab cards · notes mirror)</w:t>
+              <w:t>01-ch1-energy-causes-change-slides.pptx — FINAL (45 slides, 16:9) · BQ 2/3/33 · V1 10–12 · V2 20–22 · N1 13–16 · N2 17–19 · N3 23–27 · N4 28–31 · demo 4, 6–9 · review 34–45 · Reader pp. 1–6</w:t>
             </w:r>
           </w:p>
         </w:tc>
@@ -16471,6 +16471,1035 @@
         </w:tc>
       </w:tr>
     </w:tbl>
+    <w:p>
+      <w:r>
+        <w:br w:type="page"/>
+      </w:r>
+    </w:p>
+    <w:p>
+      <w:pPr>
+        <w:spacing w:before="2400" w:after="600"/>
+        <w:pBdr>
+          <w:bottom w:val="single" w:sz="10" w:color="#1A1D26"/>
+        </w:pBdr>
+      </w:pPr>
+      <w:r>
+        <w:rPr>
+          <w:rFonts w:ascii="Avenir Next" w:hAnsi="Avenir Next"/>
+          <w:b/>
+          <w:i w:val="0"/>
+          <w:color w:val="1F2A5A"/>
+          <w:sz w:val="28"/>
+        </w:rPr>
+        <w:t>CHAPTER 1 — SLIDESHOW MAP (FINAL)</w:t>
+      </w:r>
+    </w:p>
+    <w:tbl>
+      <w:tblPr>
+        <w:tblW w:type="auto" w:w="0"/>
+        <w:tblLook w:firstColumn="1" w:firstRow="1" w:lastColumn="0" w:lastRow="0" w:noHBand="0" w:noVBand="1" w:val="04A0"/>
+        <w:tblBorders>
+          <w:top w:val="none"/>
+          <w:left w:val="none"/>
+          <w:bottom w:val="none"/>
+          <w:right w:val="none"/>
+          <w:insideH w:val="none"/>
+          <w:insideV w:val="none"/>
+        </w:tblBorders>
+      </w:tblPr>
+      <w:tblGrid>
+        <w:gridCol w:w="10080"/>
+      </w:tblGrid>
+      <w:tr>
+        <w:tc>
+          <w:tcPr>
+            <w:tcW w:type="dxa" w:w="10080"/>
+            <w:tcMar>
+              <w:top w:w="60" w:type="dxa"/>
+              <w:left w:w="110" w:type="dxa"/>
+              <w:bottom w:w="60" w:type="dxa"/>
+              <w:right w:w="110" w:type="dxa"/>
+            </w:tcMar>
+            <w:shd w:val="clear" w:color="auto" w:fill="#F6F7F9"/>
+            <w:tcBorders>
+              <w:left w:val="single" w:sz="18" w:color="#1F2A5A"/>
+            </w:tcBorders>
+          </w:tcPr>
+          <w:p>
+            <w:r>
+              <w:rPr>
+                <w:rFonts w:ascii="Avenir Next" w:hAnsi="Avenir Next"/>
+                <w:b/>
+                <w:i w:val="0"/>
+                <w:color w:val="1F2A5A"/>
+                <w:sz w:val="21"/>
+              </w:rPr>
+              <w:t xml:space="preserve">FILE   </w:t>
+            </w:r>
+            <w:r>
+              <w:rPr>
+                <w:rFonts w:ascii="Avenir Next" w:hAnsi="Avenir Next"/>
+                <w:b w:val="0"/>
+                <w:i w:val="0"/>
+                <w:color w:val="1A1D26"/>
+                <w:sz w:val="21"/>
+              </w:rPr>
+              <w:t>production/slides/01-ch1-energy-causes-change-slides.pptx — 45 slides (16:9). Rendered PDF + 45 PNG previews alongside. Speaker notes on every slide (MODE · TIME · ASK · LISTEN FOR · REVEAL · NEXT).</w:t>
+            </w:r>
+          </w:p>
+        </w:tc>
+      </w:tr>
+    </w:tbl>
+    <w:p>
+      <w:pPr>
+        <w:spacing w:before="0" w:after="200"/>
+      </w:pPr>
+    </w:p>
+    <w:tbl>
+      <w:tblPr>
+        <w:tblW w:type="auto" w:w="0"/>
+        <w:tblLayout w:type="fixed"/>
+        <w:tblLook w:firstColumn="1" w:firstRow="1" w:lastColumn="0" w:lastRow="0" w:noHBand="0" w:noVBand="1" w:val="04A0"/>
+        <w:tblBorders>
+          <w:top w:val="none"/>
+          <w:left w:val="none"/>
+          <w:bottom w:val="none"/>
+          <w:right w:val="none"/>
+          <w:insideH w:val="none"/>
+          <w:insideV w:val="none"/>
+        </w:tblBorders>
+      </w:tblPr>
+      <w:tblGrid>
+        <w:gridCol w:w="3360"/>
+        <w:gridCol w:w="3360"/>
+        <w:gridCol w:w="3360"/>
+      </w:tblGrid>
+      <w:tr>
+        <w:trPr>
+          <w:tblHeader w:val="true"/>
+        </w:trPr>
+        <w:tc>
+          <w:tcPr>
+            <w:tcW w:type="dxa" w:w="2736"/>
+            <w:tcMar>
+              <w:top w:w="40" w:type="dxa"/>
+              <w:left w:w="60" w:type="dxa"/>
+              <w:bottom w:w="40" w:type="dxa"/>
+              <w:right w:w="60" w:type="dxa"/>
+            </w:tcMar>
+            <w:shd w:val="clear" w:color="auto" w:fill="#1A1D26"/>
+            <w:vAlign w:val="center"/>
+          </w:tcPr>
+          <w:p>
+            <w:r>
+              <w:rPr>
+                <w:rFonts w:ascii="Avenir Next" w:hAnsi="Avenir Next"/>
+                <w:b/>
+                <w:i w:val="0"/>
+                <w:color w:val="FFFFFF"/>
+                <w:sz w:val="18"/>
+              </w:rPr>
+              <w:t>ANCHOR</w:t>
+            </w:r>
+          </w:p>
+        </w:tc>
+        <w:tc>
+          <w:tcPr>
+            <w:tcW w:type="dxa" w:w="1584"/>
+            <w:tcMar>
+              <w:top w:w="40" w:type="dxa"/>
+              <w:left w:w="60" w:type="dxa"/>
+              <w:bottom w:w="40" w:type="dxa"/>
+              <w:right w:w="60" w:type="dxa"/>
+            </w:tcMar>
+            <w:shd w:val="clear" w:color="auto" w:fill="#1A1D26"/>
+            <w:vAlign w:val="center"/>
+          </w:tcPr>
+          <w:p>
+            <w:r>
+              <w:rPr>
+                <w:rFonts w:ascii="Avenir Next" w:hAnsi="Avenir Next"/>
+                <w:b/>
+                <w:i w:val="0"/>
+                <w:color w:val="FFFFFF"/>
+                <w:sz w:val="18"/>
+              </w:rPr>
+              <w:t>SLIDES</w:t>
+            </w:r>
+          </w:p>
+        </w:tc>
+        <w:tc>
+          <w:tcPr>
+            <w:tcW w:type="dxa" w:w="5760"/>
+            <w:tcMar>
+              <w:top w:w="40" w:type="dxa"/>
+              <w:left w:w="60" w:type="dxa"/>
+              <w:bottom w:w="40" w:type="dxa"/>
+              <w:right w:w="60" w:type="dxa"/>
+            </w:tcMar>
+            <w:shd w:val="clear" w:color="auto" w:fill="#1A1D26"/>
+            <w:vAlign w:val="center"/>
+          </w:tcPr>
+          <w:p>
+            <w:r>
+              <w:rPr>
+                <w:rFonts w:ascii="Avenir Next" w:hAnsi="Avenir Next"/>
+                <w:b/>
+                <w:i w:val="0"/>
+                <w:color w:val="FFFFFF"/>
+                <w:sz w:val="18"/>
+              </w:rPr>
+              <w:t>WHAT HAPPENS ON SCREEN</w:t>
+            </w:r>
+          </w:p>
+        </w:tc>
+      </w:tr>
+      <w:tr>
+        <w:tc>
+          <w:tcPr>
+            <w:tcW w:type="dxa" w:w="2736"/>
+            <w:tcMar>
+              <w:top w:w="36" w:type="dxa"/>
+              <w:left w:w="60" w:type="dxa"/>
+              <w:bottom w:w="36" w:type="dxa"/>
+              <w:right w:w="60" w:type="dxa"/>
+            </w:tcMar>
+            <w:vAlign w:val="center"/>
+            <w:tcBorders>
+              <w:bottom w:val="single" w:sz="4" w:color="#D8DCE4"/>
+            </w:tcBorders>
+          </w:tcPr>
+          <w:p>
+            <w:r>
+              <w:rPr>
+                <w:rFonts w:ascii="Avenir Next" w:hAnsi="Avenir Next"/>
+                <w:b/>
+                <w:i w:val="0"/>
+                <w:color w:val="1A1D26"/>
+                <w:sz w:val="18"/>
+              </w:rPr>
+              <w:t>BQ</w:t>
+            </w:r>
+          </w:p>
+        </w:tc>
+        <w:tc>
+          <w:tcPr>
+            <w:tcW w:type="dxa" w:w="1584"/>
+            <w:tcMar>
+              <w:top w:w="36" w:type="dxa"/>
+              <w:left w:w="60" w:type="dxa"/>
+              <w:bottom w:w="36" w:type="dxa"/>
+              <w:right w:w="60" w:type="dxa"/>
+            </w:tcMar>
+            <w:vAlign w:val="center"/>
+            <w:tcBorders>
+              <w:bottom w:val="single" w:sz="4" w:color="#D8DCE4"/>
+            </w:tcBorders>
+          </w:tcPr>
+          <w:p>
+            <w:r>
+              <w:rPr>
+                <w:rFonts w:ascii="Avenir Next" w:hAnsi="Avenir Next"/>
+                <w:b w:val="0"/>
+                <w:i w:val="0"/>
+                <w:color w:val="4A5268"/>
+                <w:sz w:val="18"/>
+              </w:rPr>
+              <w:t>2 · 3 · 33</w:t>
+            </w:r>
+          </w:p>
+        </w:tc>
+        <w:tc>
+          <w:tcPr>
+            <w:tcW w:type="dxa" w:w="5760"/>
+            <w:tcMar>
+              <w:top w:w="36" w:type="dxa"/>
+              <w:left w:w="60" w:type="dxa"/>
+              <w:bottom w:w="36" w:type="dxa"/>
+              <w:right w:w="60" w:type="dxa"/>
+            </w:tcMar>
+            <w:vAlign w:val="center"/>
+            <w:tcBorders>
+              <w:bottom w:val="single" w:sz="4" w:color="#D8DCE4"/>
+            </w:tcBorders>
+          </w:tcPr>
+          <w:p>
+            <w:r>
+              <w:rPr>
+                <w:rFonts w:ascii="Avenir Next" w:hAnsi="Avenir Next"/>
+                <w:b w:val="0"/>
+                <w:i w:val="0"/>
+                <w:color w:val="4A5268"/>
+                <w:sz w:val="18"/>
+              </w:rPr>
+              <w:t>2 = Big Question banner + TURN &amp; TALK · 3 = My first thinking (write) · 33 = BQ · NOW I THINK (return, write)</w:t>
+            </w:r>
+          </w:p>
+        </w:tc>
+      </w:tr>
+      <w:tr>
+        <w:tc>
+          <w:tcPr>
+            <w:tcW w:type="dxa" w:w="2736"/>
+            <w:tcMar>
+              <w:top w:w="36" w:type="dxa"/>
+              <w:left w:w="60" w:type="dxa"/>
+              <w:bottom w:w="36" w:type="dxa"/>
+              <w:right w:w="60" w:type="dxa"/>
+            </w:tcMar>
+            <w:vAlign w:val="center"/>
+            <w:tcBorders>
+              <w:bottom w:val="single" w:sz="4" w:color="#D8DCE4"/>
+            </w:tcBorders>
+          </w:tcPr>
+          <w:p>
+            <w:r>
+              <w:rPr>
+                <w:rFonts w:ascii="Avenir Next" w:hAnsi="Avenir Next"/>
+                <w:b/>
+                <w:i w:val="0"/>
+                <w:color w:val="1A1D26"/>
+                <w:sz w:val="18"/>
+              </w:rPr>
+              <w:t>V1 (energy · change)</w:t>
+            </w:r>
+          </w:p>
+        </w:tc>
+        <w:tc>
+          <w:tcPr>
+            <w:tcW w:type="dxa" w:w="1584"/>
+            <w:tcMar>
+              <w:top w:w="36" w:type="dxa"/>
+              <w:left w:w="60" w:type="dxa"/>
+              <w:bottom w:w="36" w:type="dxa"/>
+              <w:right w:w="60" w:type="dxa"/>
+            </w:tcMar>
+            <w:vAlign w:val="center"/>
+            <w:tcBorders>
+              <w:bottom w:val="single" w:sz="4" w:color="#D8DCE4"/>
+            </w:tcBorders>
+          </w:tcPr>
+          <w:p>
+            <w:r>
+              <w:rPr>
+                <w:rFonts w:ascii="Avenir Next" w:hAnsi="Avenir Next"/>
+                <w:b w:val="0"/>
+                <w:i w:val="0"/>
+                <w:color w:val="4A5268"/>
+                <w:sz w:val="18"/>
+              </w:rPr>
+              <w:t>10–12</w:t>
+            </w:r>
+          </w:p>
+        </w:tc>
+        <w:tc>
+          <w:tcPr>
+            <w:tcW w:type="dxa" w:w="5760"/>
+            <w:tcMar>
+              <w:top w:w="36" w:type="dxa"/>
+              <w:left w:w="60" w:type="dxa"/>
+              <w:bottom w:w="36" w:type="dxa"/>
+              <w:right w:w="60" w:type="dxa"/>
+            </w:tcMar>
+            <w:vAlign w:val="center"/>
+            <w:tcBorders>
+              <w:bottom w:val="single" w:sz="4" w:color="#D8DCE4"/>
+            </w:tcBorders>
+          </w:tcPr>
+          <w:p>
+            <w:r>
+              <w:rPr>
+                <w:rFonts w:ascii="Avenir Next" w:hAnsi="Avenir Next"/>
+                <w:b w:val="0"/>
+                <w:i w:val="0"/>
+                <w:color w:val="4A5268"/>
+                <w:sz w:val="18"/>
+              </w:rPr>
+              <w:t>10 = two vocab cards · 11 = notes write · 12 = notes reveal (change · different)</w:t>
+            </w:r>
+          </w:p>
+        </w:tc>
+      </w:tr>
+      <w:tr>
+        <w:tc>
+          <w:tcPr>
+            <w:tcW w:type="dxa" w:w="2736"/>
+            <w:tcMar>
+              <w:top w:w="36" w:type="dxa"/>
+              <w:left w:w="60" w:type="dxa"/>
+              <w:bottom w:w="36" w:type="dxa"/>
+              <w:right w:w="60" w:type="dxa"/>
+            </w:tcMar>
+            <w:vAlign w:val="center"/>
+            <w:tcBorders>
+              <w:bottom w:val="single" w:sz="4" w:color="#D8DCE4"/>
+            </w:tcBorders>
+          </w:tcPr>
+          <w:p>
+            <w:r>
+              <w:rPr>
+                <w:rFonts w:ascii="Avenir Next" w:hAnsi="Avenir Next"/>
+                <w:b/>
+                <w:i w:val="0"/>
+                <w:color w:val="1A1D26"/>
+                <w:sz w:val="18"/>
+              </w:rPr>
+              <w:t>V2 (stored energy)</w:t>
+            </w:r>
+          </w:p>
+        </w:tc>
+        <w:tc>
+          <w:tcPr>
+            <w:tcW w:type="dxa" w:w="1584"/>
+            <w:tcMar>
+              <w:top w:w="36" w:type="dxa"/>
+              <w:left w:w="60" w:type="dxa"/>
+              <w:bottom w:w="36" w:type="dxa"/>
+              <w:right w:w="60" w:type="dxa"/>
+            </w:tcMar>
+            <w:vAlign w:val="center"/>
+            <w:tcBorders>
+              <w:bottom w:val="single" w:sz="4" w:color="#D8DCE4"/>
+            </w:tcBorders>
+          </w:tcPr>
+          <w:p>
+            <w:r>
+              <w:rPr>
+                <w:rFonts w:ascii="Avenir Next" w:hAnsi="Avenir Next"/>
+                <w:b w:val="0"/>
+                <w:i w:val="0"/>
+                <w:color w:val="4A5268"/>
+                <w:sz w:val="18"/>
+              </w:rPr>
+              <w:t>20–22</w:t>
+            </w:r>
+          </w:p>
+        </w:tc>
+        <w:tc>
+          <w:tcPr>
+            <w:tcW w:type="dxa" w:w="5760"/>
+            <w:tcMar>
+              <w:top w:w="36" w:type="dxa"/>
+              <w:left w:w="60" w:type="dxa"/>
+              <w:bottom w:w="36" w:type="dxa"/>
+              <w:right w:w="60" w:type="dxa"/>
+            </w:tcMar>
+            <w:vAlign w:val="center"/>
+            <w:tcBorders>
+              <w:bottom w:val="single" w:sz="4" w:color="#D8DCE4"/>
+            </w:tcBorders>
+          </w:tcPr>
+          <w:p>
+            <w:r>
+              <w:rPr>
+                <w:rFonts w:ascii="Avenir Next" w:hAnsi="Avenir Next"/>
+                <w:b w:val="0"/>
+                <w:i w:val="0"/>
+                <w:color w:val="4A5268"/>
+                <w:sz w:val="18"/>
+              </w:rPr>
+              <w:t>20 = one large vocab card · 21 = notes write · 22 = notes reveal (later)</w:t>
+            </w:r>
+          </w:p>
+        </w:tc>
+      </w:tr>
+      <w:tr>
+        <w:tc>
+          <w:tcPr>
+            <w:tcW w:type="dxa" w:w="2736"/>
+            <w:tcMar>
+              <w:top w:w="36" w:type="dxa"/>
+              <w:left w:w="60" w:type="dxa"/>
+              <w:bottom w:w="36" w:type="dxa"/>
+              <w:right w:w="60" w:type="dxa"/>
+            </w:tcMar>
+            <w:vAlign w:val="center"/>
+            <w:tcBorders>
+              <w:bottom w:val="single" w:sz="4" w:color="#D8DCE4"/>
+            </w:tcBorders>
+          </w:tcPr>
+          <w:p>
+            <w:r>
+              <w:rPr>
+                <w:rFonts w:ascii="Avenir Next" w:hAnsi="Avenir Next"/>
+                <w:b/>
+                <w:i w:val="0"/>
+                <w:color w:val="1A1D26"/>
+                <w:sz w:val="18"/>
+              </w:rPr>
+              <w:t>N1 Energy Causes Change</w:t>
+            </w:r>
+          </w:p>
+        </w:tc>
+        <w:tc>
+          <w:tcPr>
+            <w:tcW w:type="dxa" w:w="1584"/>
+            <w:tcMar>
+              <w:top w:w="36" w:type="dxa"/>
+              <w:left w:w="60" w:type="dxa"/>
+              <w:bottom w:w="36" w:type="dxa"/>
+              <w:right w:w="60" w:type="dxa"/>
+            </w:tcMar>
+            <w:vAlign w:val="center"/>
+            <w:tcBorders>
+              <w:bottom w:val="single" w:sz="4" w:color="#D8DCE4"/>
+            </w:tcBorders>
+          </w:tcPr>
+          <w:p>
+            <w:r>
+              <w:rPr>
+                <w:rFonts w:ascii="Avenir Next" w:hAnsi="Avenir Next"/>
+                <w:b w:val="0"/>
+                <w:i w:val="0"/>
+                <w:color w:val="4A5268"/>
+                <w:sz w:val="18"/>
+              </w:rPr>
+              <w:t>13–16</w:t>
+            </w:r>
+          </w:p>
+        </w:tc>
+        <w:tc>
+          <w:tcPr>
+            <w:tcW w:type="dxa" w:w="5760"/>
+            <w:tcMar>
+              <w:top w:w="36" w:type="dxa"/>
+              <w:left w:w="60" w:type="dxa"/>
+              <w:bottom w:w="36" w:type="dxa"/>
+              <w:right w:w="60" w:type="dxa"/>
+            </w:tcMar>
+            <w:vAlign w:val="center"/>
+            <w:tcBorders>
+              <w:bottom w:val="single" w:sz="4" w:color="#D8DCE4"/>
+            </w:tcBorders>
+          </w:tcPr>
+          <w:p>
+            <w:r>
+              <w:rPr>
+                <w:rFonts w:ascii="Avenir Next" w:hAnsi="Avenir Next"/>
+                <w:b w:val="0"/>
+                <w:i w:val="0"/>
+                <w:color w:val="4A5268"/>
+                <w:sz w:val="18"/>
+              </w:rPr>
+              <w:t>13 = definition · 14 = ENERGY → CHANGE → EVIDENCE model · 15 = write · 16 = reveal (cause · change · evidence)</w:t>
+            </w:r>
+          </w:p>
+        </w:tc>
+      </w:tr>
+      <w:tr>
+        <w:tc>
+          <w:tcPr>
+            <w:tcW w:type="dxa" w:w="2736"/>
+            <w:tcMar>
+              <w:top w:w="36" w:type="dxa"/>
+              <w:left w:w="60" w:type="dxa"/>
+              <w:bottom w:w="36" w:type="dxa"/>
+              <w:right w:w="60" w:type="dxa"/>
+            </w:tcMar>
+            <w:vAlign w:val="center"/>
+            <w:tcBorders>
+              <w:bottom w:val="single" w:sz="4" w:color="#D8DCE4"/>
+            </w:tcBorders>
+          </w:tcPr>
+          <w:p>
+            <w:r>
+              <w:rPr>
+                <w:rFonts w:ascii="Avenir Next" w:hAnsi="Avenir Next"/>
+                <w:b/>
+                <w:i w:val="0"/>
+                <w:color w:val="1A1D26"/>
+                <w:sz w:val="18"/>
+              </w:rPr>
+              <w:t>N2 Energy Occurs in Different Forms</w:t>
+            </w:r>
+          </w:p>
+        </w:tc>
+        <w:tc>
+          <w:tcPr>
+            <w:tcW w:type="dxa" w:w="1584"/>
+            <w:tcMar>
+              <w:top w:w="36" w:type="dxa"/>
+              <w:left w:w="60" w:type="dxa"/>
+              <w:bottom w:w="36" w:type="dxa"/>
+              <w:right w:w="60" w:type="dxa"/>
+            </w:tcMar>
+            <w:vAlign w:val="center"/>
+            <w:tcBorders>
+              <w:bottom w:val="single" w:sz="4" w:color="#D8DCE4"/>
+            </w:tcBorders>
+          </w:tcPr>
+          <w:p>
+            <w:r>
+              <w:rPr>
+                <w:rFonts w:ascii="Avenir Next" w:hAnsi="Avenir Next"/>
+                <w:b w:val="0"/>
+                <w:i w:val="0"/>
+                <w:color w:val="4A5268"/>
+                <w:sz w:val="18"/>
+              </w:rPr>
+              <w:t>17–19</w:t>
+            </w:r>
+          </w:p>
+        </w:tc>
+        <w:tc>
+          <w:tcPr>
+            <w:tcW w:type="dxa" w:w="5760"/>
+            <w:tcMar>
+              <w:top w:w="36" w:type="dxa"/>
+              <w:left w:w="60" w:type="dxa"/>
+              <w:bottom w:w="36" w:type="dxa"/>
+              <w:right w:w="60" w:type="dxa"/>
+            </w:tcMar>
+            <w:vAlign w:val="center"/>
+            <w:tcBorders>
+              <w:bottom w:val="single" w:sz="4" w:color="#D8DCE4"/>
+            </w:tcBorders>
+          </w:tcPr>
+          <w:p>
+            <w:r>
+              <w:rPr>
+                <w:rFonts w:ascii="Avenir Next" w:hAnsi="Avenir Next"/>
+                <w:b w:val="0"/>
+                <w:i w:val="0"/>
+                <w:color w:val="4A5268"/>
+                <w:sz w:val="18"/>
+              </w:rPr>
+              <w:t>17 = five forms · 18 = clap check · 19 = 5-row form/example table</w:t>
+            </w:r>
+          </w:p>
+        </w:tc>
+      </w:tr>
+      <w:tr>
+        <w:tc>
+          <w:tcPr>
+            <w:tcW w:type="dxa" w:w="2736"/>
+            <w:tcMar>
+              <w:top w:w="36" w:type="dxa"/>
+              <w:left w:w="60" w:type="dxa"/>
+              <w:bottom w:w="36" w:type="dxa"/>
+              <w:right w:w="60" w:type="dxa"/>
+            </w:tcMar>
+            <w:vAlign w:val="center"/>
+            <w:tcBorders>
+              <w:bottom w:val="single" w:sz="4" w:color="#D8DCE4"/>
+            </w:tcBorders>
+          </w:tcPr>
+          <w:p>
+            <w:r>
+              <w:rPr>
+                <w:rFonts w:ascii="Avenir Next" w:hAnsi="Avenir Next"/>
+                <w:b/>
+                <w:i w:val="0"/>
+                <w:color w:val="1A1D26"/>
+                <w:sz w:val="18"/>
+              </w:rPr>
+              <w:t>N3 Objects Can Store Energy</w:t>
+            </w:r>
+          </w:p>
+        </w:tc>
+        <w:tc>
+          <w:tcPr>
+            <w:tcW w:type="dxa" w:w="1584"/>
+            <w:tcMar>
+              <w:top w:w="36" w:type="dxa"/>
+              <w:left w:w="60" w:type="dxa"/>
+              <w:bottom w:w="36" w:type="dxa"/>
+              <w:right w:w="60" w:type="dxa"/>
+            </w:tcMar>
+            <w:vAlign w:val="center"/>
+            <w:tcBorders>
+              <w:bottom w:val="single" w:sz="4" w:color="#D8DCE4"/>
+            </w:tcBorders>
+          </w:tcPr>
+          <w:p>
+            <w:r>
+              <w:rPr>
+                <w:rFonts w:ascii="Avenir Next" w:hAnsi="Avenir Next"/>
+                <w:b w:val="0"/>
+                <w:i w:val="0"/>
+                <w:color w:val="4A5268"/>
+                <w:sz w:val="18"/>
+              </w:rPr>
+              <w:t>23–27</w:t>
+            </w:r>
+          </w:p>
+        </w:tc>
+        <w:tc>
+          <w:tcPr>
+            <w:tcW w:type="dxa" w:w="5760"/>
+            <w:tcMar>
+              <w:top w:w="36" w:type="dxa"/>
+              <w:left w:w="60" w:type="dxa"/>
+              <w:bottom w:w="36" w:type="dxa"/>
+              <w:right w:w="60" w:type="dxa"/>
+            </w:tcMar>
+            <w:vAlign w:val="center"/>
+            <w:tcBorders>
+              <w:bottom w:val="single" w:sz="4" w:color="#D8DCE4"/>
+            </w:tcBorders>
+          </w:tcPr>
+          <w:p>
+            <w:r>
+              <w:rPr>
+                <w:rFonts w:ascii="Avenir Next" w:hAnsi="Avenir Next"/>
+                <w:b w:val="0"/>
+                <w:i w:val="0"/>
+                <w:color w:val="4A5268"/>
+                <w:sz w:val="18"/>
+              </w:rPr>
+              <w:t>23 = still-battery predict · 24 = position · 25 = STORED → RELEASE → CHANGE model · 26 = write · 27 = reveal (position)</w:t>
+            </w:r>
+          </w:p>
+        </w:tc>
+      </w:tr>
+      <w:tr>
+        <w:tc>
+          <w:tcPr>
+            <w:tcW w:type="dxa" w:w="2736"/>
+            <w:tcMar>
+              <w:top w:w="36" w:type="dxa"/>
+              <w:left w:w="60" w:type="dxa"/>
+              <w:bottom w:w="36" w:type="dxa"/>
+              <w:right w:w="60" w:type="dxa"/>
+            </w:tcMar>
+            <w:vAlign w:val="center"/>
+            <w:tcBorders>
+              <w:bottom w:val="single" w:sz="4" w:color="#D8DCE4"/>
+            </w:tcBorders>
+          </w:tcPr>
+          <w:p>
+            <w:r>
+              <w:rPr>
+                <w:rFonts w:ascii="Avenir Next" w:hAnsi="Avenir Next"/>
+                <w:b/>
+                <w:i w:val="0"/>
+                <w:color w:val="1A1D26"/>
+                <w:sz w:val="18"/>
+              </w:rPr>
+              <w:t>N4 Recognizing Evidence</w:t>
+            </w:r>
+          </w:p>
+        </w:tc>
+        <w:tc>
+          <w:tcPr>
+            <w:tcW w:type="dxa" w:w="1584"/>
+            <w:tcMar>
+              <w:top w:w="36" w:type="dxa"/>
+              <w:left w:w="60" w:type="dxa"/>
+              <w:bottom w:w="36" w:type="dxa"/>
+              <w:right w:w="60" w:type="dxa"/>
+            </w:tcMar>
+            <w:vAlign w:val="center"/>
+            <w:tcBorders>
+              <w:bottom w:val="single" w:sz="4" w:color="#D8DCE4"/>
+            </w:tcBorders>
+          </w:tcPr>
+          <w:p>
+            <w:r>
+              <w:rPr>
+                <w:rFonts w:ascii="Avenir Next" w:hAnsi="Avenir Next"/>
+                <w:b w:val="0"/>
+                <w:i w:val="0"/>
+                <w:color w:val="4A5268"/>
+                <w:sz w:val="18"/>
+              </w:rPr>
+              <w:t>28–31</w:t>
+            </w:r>
+          </w:p>
+        </w:tc>
+        <w:tc>
+          <w:tcPr>
+            <w:tcW w:type="dxa" w:w="5760"/>
+            <w:tcMar>
+              <w:top w:w="36" w:type="dxa"/>
+              <w:left w:w="60" w:type="dxa"/>
+              <w:bottom w:w="36" w:type="dxa"/>
+              <w:right w:w="60" w:type="dxa"/>
+            </w:tcMar>
+            <w:vAlign w:val="center"/>
+            <w:tcBorders>
+              <w:bottom w:val="single" w:sz="4" w:color="#D8DCE4"/>
+            </w:tcBorders>
+          </w:tcPr>
+          <w:p>
+            <w:r>
+              <w:rPr>
+                <w:rFonts w:ascii="Avenir Next" w:hAnsi="Avenir Next"/>
+                <w:b w:val="0"/>
+                <w:i w:val="0"/>
+                <w:color w:val="4A5268"/>
+                <w:sz w:val="18"/>
+              </w:rPr>
+              <w:t>28 = evidence concept · 29 = BEFORE/AFTER draw · 30 = CHECK YOUR THINKING write · 31 = sample + classify</w:t>
+            </w:r>
+          </w:p>
+        </w:tc>
+      </w:tr>
+      <w:tr>
+        <w:tc>
+          <w:tcPr>
+            <w:tcW w:type="dxa" w:w="2736"/>
+            <w:tcMar>
+              <w:top w:w="36" w:type="dxa"/>
+              <w:left w:w="60" w:type="dxa"/>
+              <w:bottom w:w="36" w:type="dxa"/>
+              <w:right w:w="60" w:type="dxa"/>
+            </w:tcMar>
+            <w:vAlign w:val="center"/>
+            <w:tcBorders>
+              <w:bottom w:val="single" w:sz="4" w:color="#D8DCE4"/>
+            </w:tcBorders>
+          </w:tcPr>
+          <w:p>
+            <w:r>
+              <w:rPr>
+                <w:rFonts w:ascii="Avenir Next" w:hAnsi="Avenir Next"/>
+                <w:b/>
+                <w:i w:val="0"/>
+                <w:color w:val="1A1D26"/>
+                <w:sz w:val="18"/>
+              </w:rPr>
+              <w:t>Phenomenon / demo</w:t>
+            </w:r>
+          </w:p>
+        </w:tc>
+        <w:tc>
+          <w:tcPr>
+            <w:tcW w:type="dxa" w:w="1584"/>
+            <w:tcMar>
+              <w:top w:w="36" w:type="dxa"/>
+              <w:left w:w="60" w:type="dxa"/>
+              <w:bottom w:w="36" w:type="dxa"/>
+              <w:right w:w="60" w:type="dxa"/>
+            </w:tcMar>
+            <w:vAlign w:val="center"/>
+            <w:tcBorders>
+              <w:bottom w:val="single" w:sz="4" w:color="#D8DCE4"/>
+            </w:tcBorders>
+          </w:tcPr>
+          <w:p>
+            <w:r>
+              <w:rPr>
+                <w:rFonts w:ascii="Avenir Next" w:hAnsi="Avenir Next"/>
+                <w:b w:val="0"/>
+                <w:i w:val="0"/>
+                <w:color w:val="4A5268"/>
+                <w:sz w:val="18"/>
+              </w:rPr>
+              <w:t>4 · 6–9</w:t>
+            </w:r>
+          </w:p>
+        </w:tc>
+        <w:tc>
+          <w:tcPr>
+            <w:tcW w:type="dxa" w:w="5760"/>
+            <w:tcMar>
+              <w:top w:w="36" w:type="dxa"/>
+              <w:left w:w="60" w:type="dxa"/>
+              <w:bottom w:w="36" w:type="dxa"/>
+              <w:right w:w="60" w:type="dxa"/>
+            </w:tcMar>
+            <w:vAlign w:val="center"/>
+            <w:tcBorders>
+              <w:bottom w:val="single" w:sz="4" w:color="#D8DCE4"/>
+            </w:tcBorders>
+          </w:tcPr>
+          <w:p>
+            <w:r>
+              <w:rPr>
+                <w:rFonts w:ascii="Avenir Next" w:hAnsi="Avenir Next"/>
+                <w:b w:val="0"/>
+                <w:i w:val="0"/>
+                <w:color w:val="4A5268"/>
+                <w:sz w:val="18"/>
+              </w:rPr>
+              <w:t>4 = light-switch change · 6 = observe dull pencil · 7 = predict · 8 = before/after · 9 = change = evidence</w:t>
+            </w:r>
+          </w:p>
+        </w:tc>
+      </w:tr>
+      <w:tr>
+        <w:tc>
+          <w:tcPr>
+            <w:tcW w:type="dxa" w:w="2736"/>
+            <w:tcMar>
+              <w:top w:w="36" w:type="dxa"/>
+              <w:left w:w="60" w:type="dxa"/>
+              <w:bottom w:w="36" w:type="dxa"/>
+              <w:right w:w="60" w:type="dxa"/>
+            </w:tcMar>
+            <w:vAlign w:val="center"/>
+            <w:tcBorders>
+              <w:bottom w:val="single" w:sz="4" w:color="#D8DCE4"/>
+            </w:tcBorders>
+          </w:tcPr>
+          <w:p>
+            <w:r>
+              <w:rPr>
+                <w:rFonts w:ascii="Avenir Next" w:hAnsi="Avenir Next"/>
+                <w:b/>
+                <w:i w:val="0"/>
+                <w:color w:val="1A1D26"/>
+                <w:sz w:val="18"/>
+              </w:rPr>
+              <w:t>Application / evidence</w:t>
+            </w:r>
+          </w:p>
+        </w:tc>
+        <w:tc>
+          <w:tcPr>
+            <w:tcW w:type="dxa" w:w="1584"/>
+            <w:tcMar>
+              <w:top w:w="36" w:type="dxa"/>
+              <w:left w:w="60" w:type="dxa"/>
+              <w:bottom w:w="36" w:type="dxa"/>
+              <w:right w:w="60" w:type="dxa"/>
+            </w:tcMar>
+            <w:vAlign w:val="center"/>
+            <w:tcBorders>
+              <w:bottom w:val="single" w:sz="4" w:color="#D8DCE4"/>
+            </w:tcBorders>
+          </w:tcPr>
+          <w:p>
+            <w:r>
+              <w:rPr>
+                <w:rFonts w:ascii="Avenir Next" w:hAnsi="Avenir Next"/>
+                <w:b w:val="0"/>
+                <w:i w:val="0"/>
+                <w:color w:val="4A5268"/>
+                <w:sz w:val="18"/>
+              </w:rPr>
+              <w:t>32</w:t>
+            </w:r>
+          </w:p>
+        </w:tc>
+        <w:tc>
+          <w:tcPr>
+            <w:tcW w:type="dxa" w:w="5760"/>
+            <w:tcMar>
+              <w:top w:w="36" w:type="dxa"/>
+              <w:left w:w="60" w:type="dxa"/>
+              <w:bottom w:w="36" w:type="dxa"/>
+              <w:right w:w="60" w:type="dxa"/>
+            </w:tcMar>
+            <w:vAlign w:val="center"/>
+            <w:tcBorders>
+              <w:bottom w:val="single" w:sz="4" w:color="#D8DCE4"/>
+            </w:tcBorders>
+          </w:tcPr>
+          <w:p>
+            <w:r>
+              <w:rPr>
+                <w:rFonts w:ascii="Avenir Next" w:hAnsi="Avenir Next"/>
+                <w:b w:val="0"/>
+                <w:i w:val="0"/>
+                <w:color w:val="4A5268"/>
+                <w:sz w:val="18"/>
+              </w:rPr>
+              <w:t>Which change shows energy at work? (choose the change)</w:t>
+            </w:r>
+          </w:p>
+        </w:tc>
+      </w:tr>
+      <w:tr>
+        <w:tc>
+          <w:tcPr>
+            <w:tcW w:type="dxa" w:w="2736"/>
+            <w:tcMar>
+              <w:top w:w="36" w:type="dxa"/>
+              <w:left w:w="60" w:type="dxa"/>
+              <w:bottom w:w="36" w:type="dxa"/>
+              <w:right w:w="60" w:type="dxa"/>
+            </w:tcMar>
+            <w:vAlign w:val="center"/>
+            <w:tcBorders>
+              <w:bottom w:val="single" w:sz="4" w:color="#D8DCE4"/>
+            </w:tcBorders>
+          </w:tcPr>
+          <w:p>
+            <w:r>
+              <w:rPr>
+                <w:rFonts w:ascii="Avenir Next" w:hAnsi="Avenir Next"/>
+                <w:b/>
+                <w:i w:val="0"/>
+                <w:color w:val="1A1D26"/>
+                <w:sz w:val="18"/>
+              </w:rPr>
+              <w:t>End-of-chapter review</w:t>
+            </w:r>
+          </w:p>
+        </w:tc>
+        <w:tc>
+          <w:tcPr>
+            <w:tcW w:type="dxa" w:w="1584"/>
+            <w:tcMar>
+              <w:top w:w="36" w:type="dxa"/>
+              <w:left w:w="60" w:type="dxa"/>
+              <w:bottom w:w="36" w:type="dxa"/>
+              <w:right w:w="60" w:type="dxa"/>
+            </w:tcMar>
+            <w:vAlign w:val="center"/>
+            <w:tcBorders>
+              <w:bottom w:val="single" w:sz="4" w:color="#D8DCE4"/>
+            </w:tcBorders>
+          </w:tcPr>
+          <w:p>
+            <w:r>
+              <w:rPr>
+                <w:rFonts w:ascii="Avenir Next" w:hAnsi="Avenir Next"/>
+                <w:b w:val="0"/>
+                <w:i w:val="0"/>
+                <w:color w:val="4A5268"/>
+                <w:sz w:val="18"/>
+              </w:rPr>
+              <w:t>34–45</w:t>
+            </w:r>
+          </w:p>
+        </w:tc>
+        <w:tc>
+          <w:tcPr>
+            <w:tcW w:type="dxa" w:w="5760"/>
+            <w:tcMar>
+              <w:top w:w="36" w:type="dxa"/>
+              <w:left w:w="60" w:type="dxa"/>
+              <w:bottom w:w="36" w:type="dxa"/>
+              <w:right w:w="60" w:type="dxa"/>
+            </w:tcMar>
+            <w:vAlign w:val="center"/>
+            <w:tcBorders>
+              <w:bottom w:val="single" w:sz="4" w:color="#D8DCE4"/>
+            </w:tcBorders>
+          </w:tcPr>
+          <w:p>
+            <w:r>
+              <w:rPr>
+                <w:rFonts w:ascii="Avenir Next" w:hAnsi="Avenir Next"/>
+                <w:b w:val="0"/>
+                <w:i w:val="0"/>
+                <w:color w:val="4A5268"/>
+                <w:sz w:val="18"/>
+              </w:rPr>
+              <w:t>6 multiple-choice (A/B/C/D) — question state then answer state; letters shuffled A/B/C/D/B/C</w:t>
+            </w:r>
+          </w:p>
+        </w:tc>
+      </w:tr>
+    </w:tbl>
+    <w:p>
+      <w:pPr>
+        <w:spacing w:before="0" w:after="160"/>
+      </w:pPr>
+      <w:r>
+        <w:rPr>
+          <w:rFonts w:ascii="Avenir Next" w:hAnsi="Avenir Next"/>
+          <w:b w:val="0"/>
+          <w:i/>
+          <w:color w:val="4A5268"/>
+          <w:sz w:val="18"/>
+        </w:rPr>
+        <w:t>Reader cues on-slide: V1/N1 pp. 1–2 · N2 p. 3 · V2/N3 pp. 4–5 · N4 pp. 1–6 · BQ p. 1. Timing: two 30-min blocks (Block 1 = slides 1–12 · Block 2 = slides 13–33) + review slides 34–45 as a third short block or Friday FLEX.</w:t>
+      </w:r>
+    </w:p>
     <w:p>
       <w:r>
         <w:br w:type="page"/>

</xml_diff>

<commit_message>
Complete Chapter 1 supporting resource ecosystem
</commit_message>
<xml_diff>
--- a/production/teacher-playbook/unit1-teacher-playbook.docx
+++ b/production/teacher-playbook/unit1-teacher-playbook.docx
@@ -190,7 +190,7 @@
                 <w:color w:val="1A1D26"/>
                 <w:sz w:val="21"/>
               </w:rPr>
-              <w:t>Phase 2 foundation. Chapters 2–7 spreads and special sections are PLANNED placeholders pending Phases 3–4. Chapter 1 is fully prototyped. No student curriculum artifact was modified.</w:t>
+              <w:t>Phase 5 — Chapter 1 supporting-resource ecosystem complete. Guided Notes + Slideshow are FINAL (Phases 3–4); practice/application, chapter quiz, absent-recovery, and FLEX Energy Detectives are retained; study-guide contribution + assessment trace are recorded. Chapters 2–7 spreads and special sections remain PLANNED placeholders pending later phases.</w:t>
             </w:r>
           </w:p>
         </w:tc>
@@ -6887,6 +6887,334 @@
                 <w:sz w:val="18"/>
               </w:rPr>
               <w:t>AVAILABLE</w:t>
+            </w:r>
+          </w:p>
+        </w:tc>
+        <w:tc>
+          <w:tcPr>
+            <w:tcW w:type="dxa" w:w="1080"/>
+            <w:tcMar>
+              <w:top w:w="36" w:type="dxa"/>
+              <w:left w:w="60" w:type="dxa"/>
+              <w:bottom w:w="36" w:type="dxa"/>
+              <w:right w:w="60" w:type="dxa"/>
+            </w:tcMar>
+            <w:vAlign w:val="center"/>
+            <w:tcBorders>
+              <w:bottom w:val="single" w:sz="4" w:color="#D8DCE4"/>
+            </w:tcBorders>
+          </w:tcPr>
+          <w:p>
+            <w:r>
+              <w:rPr>
+                <w:rFonts w:ascii="Avenir Next" w:hAnsi="Avenir Next"/>
+                <w:b w:val="0"/>
+                <w:i w:val="0"/>
+                <w:color w:val="4A5268"/>
+                <w:sz w:val="18"/>
+              </w:rPr>
+              <w:t>AVAILABLE</w:t>
+            </w:r>
+          </w:p>
+        </w:tc>
+      </w:tr>
+      <w:tr>
+        <w:tc>
+          <w:tcPr>
+            <w:tcW w:type="dxa" w:w="2232"/>
+            <w:tcMar>
+              <w:top w:w="36" w:type="dxa"/>
+              <w:left w:w="60" w:type="dxa"/>
+              <w:bottom w:w="36" w:type="dxa"/>
+              <w:right w:w="60" w:type="dxa"/>
+            </w:tcMar>
+            <w:vAlign w:val="center"/>
+            <w:tcBorders>
+              <w:bottom w:val="single" w:sz="4" w:color="#D8DCE4"/>
+            </w:tcBorders>
+          </w:tcPr>
+          <w:p>
+            <w:r>
+              <w:rPr>
+                <w:rFonts w:ascii="Avenir Next" w:hAnsi="Avenir Next"/>
+                <w:b/>
+                <w:i w:val="0"/>
+                <w:color w:val="1A1D26"/>
+                <w:sz w:val="18"/>
+              </w:rPr>
+              <w:t>Chapter quiz (Ch1)</w:t>
+            </w:r>
+          </w:p>
+        </w:tc>
+        <w:tc>
+          <w:tcPr>
+            <w:tcW w:type="dxa" w:w="1512"/>
+            <w:tcMar>
+              <w:top w:w="36" w:type="dxa"/>
+              <w:left w:w="60" w:type="dxa"/>
+              <w:bottom w:w="36" w:type="dxa"/>
+              <w:right w:w="60" w:type="dxa"/>
+            </w:tcMar>
+            <w:vAlign w:val="center"/>
+            <w:tcBorders>
+              <w:bottom w:val="single" w:sz="4" w:color="#D8DCE4"/>
+            </w:tcBorders>
+          </w:tcPr>
+          <w:p>
+            <w:r>
+              <w:rPr>
+                <w:rFonts w:ascii="Avenir Next" w:hAnsi="Avenir Next"/>
+                <w:b w:val="0"/>
+                <w:i w:val="0"/>
+                <w:color w:val="4A5268"/>
+                <w:sz w:val="18"/>
+              </w:rPr>
+              <w:t>Student</w:t>
+            </w:r>
+          </w:p>
+        </w:tc>
+        <w:tc>
+          <w:tcPr>
+            <w:tcW w:type="dxa" w:w="1224"/>
+            <w:tcMar>
+              <w:top w:w="36" w:type="dxa"/>
+              <w:left w:w="60" w:type="dxa"/>
+              <w:bottom w:w="36" w:type="dxa"/>
+              <w:right w:w="60" w:type="dxa"/>
+            </w:tcMar>
+            <w:vAlign w:val="center"/>
+            <w:tcBorders>
+              <w:bottom w:val="single" w:sz="4" w:color="#D8DCE4"/>
+            </w:tcBorders>
+          </w:tcPr>
+          <w:p>
+            <w:r>
+              <w:rPr>
+                <w:rFonts w:ascii="Avenir Next" w:hAnsi="Avenir Next"/>
+                <w:b w:val="0"/>
+                <w:i w:val="0"/>
+                <w:color w:val="4A5268"/>
+                <w:sz w:val="18"/>
+              </w:rPr>
+              <w:t>CORE</w:t>
+            </w:r>
+          </w:p>
+        </w:tc>
+        <w:tc>
+          <w:tcPr>
+            <w:tcW w:type="dxa" w:w="1368"/>
+            <w:tcMar>
+              <w:top w:w="36" w:type="dxa"/>
+              <w:left w:w="60" w:type="dxa"/>
+              <w:bottom w:w="36" w:type="dxa"/>
+              <w:right w:w="60" w:type="dxa"/>
+            </w:tcMar>
+            <w:vAlign w:val="center"/>
+            <w:tcBorders>
+              <w:bottom w:val="single" w:sz="4" w:color="#D8DCE4"/>
+            </w:tcBorders>
+          </w:tcPr>
+          <w:p>
+            <w:r>
+              <w:rPr>
+                <w:rFonts w:ascii="Avenir Next" w:hAnsi="Avenir Next"/>
+                <w:b w:val="0"/>
+                <w:i w:val="0"/>
+                <w:color w:val="4A5268"/>
+                <w:sz w:val="18"/>
+              </w:rPr>
+              <w:t>Formative (graded)</w:t>
+            </w:r>
+          </w:p>
+        </w:tc>
+        <w:tc>
+          <w:tcPr>
+            <w:tcW w:type="dxa" w:w="2664"/>
+            <w:tcMar>
+              <w:top w:w="36" w:type="dxa"/>
+              <w:left w:w="60" w:type="dxa"/>
+              <w:bottom w:w="36" w:type="dxa"/>
+              <w:right w:w="60" w:type="dxa"/>
+            </w:tcMar>
+            <w:vAlign w:val="center"/>
+            <w:tcBorders>
+              <w:bottom w:val="single" w:sz="4" w:color="#D8DCE4"/>
+            </w:tcBorders>
+          </w:tcPr>
+          <w:p>
+            <w:r>
+              <w:rPr>
+                <w:rFonts w:ascii="Avenir Next" w:hAnsi="Avenir Next"/>
+                <w:b w:val="0"/>
+                <w:i w:val="0"/>
+                <w:color w:val="4A5268"/>
+                <w:sz w:val="18"/>
+              </w:rPr>
+              <w:t>Ch1 AVAILABLE (9-item)</w:t>
+            </w:r>
+          </w:p>
+        </w:tc>
+        <w:tc>
+          <w:tcPr>
+            <w:tcW w:type="dxa" w:w="1080"/>
+            <w:tcMar>
+              <w:top w:w="36" w:type="dxa"/>
+              <w:left w:w="60" w:type="dxa"/>
+              <w:bottom w:w="36" w:type="dxa"/>
+              <w:right w:w="60" w:type="dxa"/>
+            </w:tcMar>
+            <w:vAlign w:val="center"/>
+            <w:tcBorders>
+              <w:bottom w:val="single" w:sz="4" w:color="#D8DCE4"/>
+            </w:tcBorders>
+          </w:tcPr>
+          <w:p>
+            <w:r>
+              <w:rPr>
+                <w:rFonts w:ascii="Avenir Next" w:hAnsi="Avenir Next"/>
+                <w:b w:val="0"/>
+                <w:i w:val="0"/>
+                <w:color w:val="4A5268"/>
+                <w:sz w:val="18"/>
+              </w:rPr>
+              <w:t>AVAILABLE</w:t>
+            </w:r>
+          </w:p>
+        </w:tc>
+      </w:tr>
+      <w:tr>
+        <w:tc>
+          <w:tcPr>
+            <w:tcW w:type="dxa" w:w="2232"/>
+            <w:tcMar>
+              <w:top w:w="36" w:type="dxa"/>
+              <w:left w:w="60" w:type="dxa"/>
+              <w:bottom w:w="36" w:type="dxa"/>
+              <w:right w:w="60" w:type="dxa"/>
+            </w:tcMar>
+            <w:vAlign w:val="center"/>
+            <w:tcBorders>
+              <w:bottom w:val="single" w:sz="4" w:color="#D8DCE4"/>
+            </w:tcBorders>
+          </w:tcPr>
+          <w:p>
+            <w:r>
+              <w:rPr>
+                <w:rFonts w:ascii="Avenir Next" w:hAnsi="Avenir Next"/>
+                <w:b/>
+                <w:i w:val="0"/>
+                <w:color w:val="1A1D26"/>
+                <w:sz w:val="18"/>
+              </w:rPr>
+              <w:t>Energy Detectives (Ch1)</w:t>
+            </w:r>
+          </w:p>
+        </w:tc>
+        <w:tc>
+          <w:tcPr>
+            <w:tcW w:type="dxa" w:w="1512"/>
+            <w:tcMar>
+              <w:top w:w="36" w:type="dxa"/>
+              <w:left w:w="60" w:type="dxa"/>
+              <w:bottom w:w="36" w:type="dxa"/>
+              <w:right w:w="60" w:type="dxa"/>
+            </w:tcMar>
+            <w:vAlign w:val="center"/>
+            <w:tcBorders>
+              <w:bottom w:val="single" w:sz="4" w:color="#D8DCE4"/>
+            </w:tcBorders>
+          </w:tcPr>
+          <w:p>
+            <w:r>
+              <w:rPr>
+                <w:rFonts w:ascii="Avenir Next" w:hAnsi="Avenir Next"/>
+                <w:b w:val="0"/>
+                <w:i w:val="0"/>
+                <w:color w:val="4A5268"/>
+                <w:sz w:val="18"/>
+              </w:rPr>
+              <w:t>Student</w:t>
+            </w:r>
+          </w:p>
+        </w:tc>
+        <w:tc>
+          <w:tcPr>
+            <w:tcW w:type="dxa" w:w="1224"/>
+            <w:tcMar>
+              <w:top w:w="36" w:type="dxa"/>
+              <w:left w:w="60" w:type="dxa"/>
+              <w:bottom w:w="36" w:type="dxa"/>
+              <w:right w:w="60" w:type="dxa"/>
+            </w:tcMar>
+            <w:vAlign w:val="center"/>
+            <w:tcBorders>
+              <w:bottom w:val="single" w:sz="4" w:color="#D8DCE4"/>
+            </w:tcBorders>
+          </w:tcPr>
+          <w:p>
+            <w:r>
+              <w:rPr>
+                <w:rFonts w:ascii="Avenir Next" w:hAnsi="Avenir Next"/>
+                <w:b w:val="0"/>
+                <w:i w:val="0"/>
+                <w:color w:val="4A5268"/>
+                <w:sz w:val="18"/>
+              </w:rPr>
+              <w:t>OPTIONAL/FLEX</w:t>
+            </w:r>
+          </w:p>
+        </w:tc>
+        <w:tc>
+          <w:tcPr>
+            <w:tcW w:type="dxa" w:w="1368"/>
+            <w:tcMar>
+              <w:top w:w="36" w:type="dxa"/>
+              <w:left w:w="60" w:type="dxa"/>
+              <w:bottom w:w="36" w:type="dxa"/>
+              <w:right w:w="60" w:type="dxa"/>
+            </w:tcMar>
+            <w:vAlign w:val="center"/>
+            <w:tcBorders>
+              <w:bottom w:val="single" w:sz="4" w:color="#D8DCE4"/>
+            </w:tcBorders>
+          </w:tcPr>
+          <w:p>
+            <w:r>
+              <w:rPr>
+                <w:rFonts w:ascii="Avenir Next" w:hAnsi="Avenir Next"/>
+                <w:b w:val="0"/>
+                <w:i w:val="0"/>
+                <w:color w:val="4A5268"/>
+                <w:sz w:val="18"/>
+              </w:rPr>
+              <w:t>No</w:t>
+            </w:r>
+          </w:p>
+        </w:tc>
+        <w:tc>
+          <w:tcPr>
+            <w:tcW w:type="dxa" w:w="2664"/>
+            <w:tcMar>
+              <w:top w:w="36" w:type="dxa"/>
+              <w:left w:w="60" w:type="dxa"/>
+              <w:bottom w:w="36" w:type="dxa"/>
+              <w:right w:w="60" w:type="dxa"/>
+            </w:tcMar>
+            <w:vAlign w:val="center"/>
+            <w:tcBorders>
+              <w:bottom w:val="single" w:sz="4" w:color="#D8DCE4"/>
+            </w:tcBorders>
+          </w:tcPr>
+          <w:p>
+            <w:r>
+              <w:rPr>
+                <w:rFonts w:ascii="Avenir Next" w:hAnsi="Avenir Next"/>
+                <w:b w:val="0"/>
+                <w:i w:val="0"/>
+                <w:color w:val="4A5268"/>
+                <w:sz w:val="18"/>
+              </w:rPr>
+              <w:t>AVAILABLE (reclassified)</w:t>
             </w:r>
           </w:p>
         </w:tc>
@@ -17517,6 +17845,1964 @@
           <w:rFonts w:ascii="Avenir Next" w:hAnsi="Avenir Next"/>
           <w:b/>
           <w:i w:val="0"/>
+          <w:color w:val="1F2A5A"/>
+          <w:sz w:val="28"/>
+        </w:rPr>
+        <w:t>CHAPTER 1 — SUPPORTING RESOURCE INDEX (PHASE 5)</w:t>
+      </w:r>
+    </w:p>
+    <w:tbl>
+      <w:tblPr>
+        <w:tblW w:type="auto" w:w="0"/>
+        <w:tblLook w:firstColumn="1" w:firstRow="1" w:lastColumn="0" w:lastRow="0" w:noHBand="0" w:noVBand="1" w:val="04A0"/>
+        <w:tblBorders>
+          <w:top w:val="none"/>
+          <w:left w:val="none"/>
+          <w:bottom w:val="none"/>
+          <w:right w:val="none"/>
+          <w:insideH w:val="none"/>
+          <w:insideV w:val="none"/>
+        </w:tblBorders>
+      </w:tblPr>
+      <w:tblGrid>
+        <w:gridCol w:w="10080"/>
+      </w:tblGrid>
+      <w:tr>
+        <w:tc>
+          <w:tcPr>
+            <w:tcW w:type="dxa" w:w="10080"/>
+            <w:tcMar>
+              <w:top w:w="60" w:type="dxa"/>
+              <w:left w:w="110" w:type="dxa"/>
+              <w:bottom w:w="60" w:type="dxa"/>
+              <w:right w:w="110" w:type="dxa"/>
+            </w:tcMar>
+            <w:shd w:val="clear" w:color="auto" w:fill="#F6F7F9"/>
+            <w:tcBorders>
+              <w:left w:val="single" w:sz="18" w:color="#1F2A5A"/>
+            </w:tcBorders>
+          </w:tcPr>
+          <w:p>
+            <w:r>
+              <w:rPr>
+                <w:rFonts w:ascii="Avenir Next" w:hAnsi="Avenir Next"/>
+                <w:b/>
+                <w:i w:val="0"/>
+                <w:color w:val="1F2A5A"/>
+                <w:sz w:val="21"/>
+              </w:rPr>
+              <w:t xml:space="preserve">PRINCIPLE   </w:t>
+            </w:r>
+            <w:r>
+              <w:rPr>
+                <w:rFonts w:ascii="Avenir Next" w:hAnsi="Avenir Next"/>
+                <w:b w:val="0"/>
+                <w:i w:val="0"/>
+                <w:color w:val="1A1D26"/>
+                <w:sz w:val="21"/>
+              </w:rPr>
+              <w:t>Lean ecosystem: every resource has a distinct instructional job; nothing merely repeats the Guided Notes. Guided Notes (primary) + Science Journal (secondary) + a separate worksheet only for a distinct apply task.</w:t>
+            </w:r>
+          </w:p>
+        </w:tc>
+      </w:tr>
+    </w:tbl>
+    <w:p>
+      <w:pPr>
+        <w:spacing w:before="0" w:after="200"/>
+      </w:pPr>
+    </w:p>
+    <w:tbl>
+      <w:tblPr>
+        <w:tblW w:type="auto" w:w="0"/>
+        <w:tblLayout w:type="fixed"/>
+        <w:tblLook w:firstColumn="1" w:firstRow="1" w:lastColumn="0" w:lastRow="0" w:noHBand="0" w:noVBand="1" w:val="04A0"/>
+        <w:tblBorders>
+          <w:top w:val="none"/>
+          <w:left w:val="none"/>
+          <w:bottom w:val="none"/>
+          <w:right w:val="none"/>
+          <w:insideH w:val="none"/>
+          <w:insideV w:val="none"/>
+        </w:tblBorders>
+      </w:tblPr>
+      <w:tblGrid>
+        <w:gridCol w:w="1680"/>
+        <w:gridCol w:w="1680"/>
+        <w:gridCol w:w="1680"/>
+        <w:gridCol w:w="1680"/>
+        <w:gridCol w:w="1680"/>
+        <w:gridCol w:w="1680"/>
+      </w:tblGrid>
+      <w:tr>
+        <w:trPr>
+          <w:tblHeader w:val="true"/>
+        </w:trPr>
+        <w:tc>
+          <w:tcPr>
+            <w:tcW w:type="dxa" w:w="1944"/>
+            <w:tcMar>
+              <w:top w:w="40" w:type="dxa"/>
+              <w:left w:w="60" w:type="dxa"/>
+              <w:bottom w:w="40" w:type="dxa"/>
+              <w:right w:w="60" w:type="dxa"/>
+            </w:tcMar>
+            <w:shd w:val="clear" w:color="auto" w:fill="#1A1D26"/>
+            <w:vAlign w:val="center"/>
+          </w:tcPr>
+          <w:p>
+            <w:r>
+              <w:rPr>
+                <w:rFonts w:ascii="Avenir Next" w:hAnsi="Avenir Next"/>
+                <w:b/>
+                <w:i w:val="0"/>
+                <w:color w:val="FFFFFF"/>
+                <w:sz w:val="18"/>
+              </w:rPr>
+              <w:t>RESOURCE</w:t>
+            </w:r>
+          </w:p>
+        </w:tc>
+        <w:tc>
+          <w:tcPr>
+            <w:tcW w:type="dxa" w:w="2736"/>
+            <w:tcMar>
+              <w:top w:w="40" w:type="dxa"/>
+              <w:left w:w="60" w:type="dxa"/>
+              <w:bottom w:w="40" w:type="dxa"/>
+              <w:right w:w="60" w:type="dxa"/>
+            </w:tcMar>
+            <w:shd w:val="clear" w:color="auto" w:fill="#1A1D26"/>
+            <w:vAlign w:val="center"/>
+          </w:tcPr>
+          <w:p>
+            <w:r>
+              <w:rPr>
+                <w:rFonts w:ascii="Avenir Next" w:hAnsi="Avenir Next"/>
+                <w:b/>
+                <w:i w:val="0"/>
+                <w:color w:val="FFFFFF"/>
+                <w:sz w:val="18"/>
+              </w:rPr>
+              <w:t>CANONICAL FILE</w:t>
+            </w:r>
+          </w:p>
+        </w:tc>
+        <w:tc>
+          <w:tcPr>
+            <w:tcW w:type="dxa" w:w="1368"/>
+            <w:tcMar>
+              <w:top w:w="40" w:type="dxa"/>
+              <w:left w:w="60" w:type="dxa"/>
+              <w:bottom w:w="40" w:type="dxa"/>
+              <w:right w:w="60" w:type="dxa"/>
+            </w:tcMar>
+            <w:shd w:val="clear" w:color="auto" w:fill="#1A1D26"/>
+            <w:vAlign w:val="center"/>
+          </w:tcPr>
+          <w:p>
+            <w:r>
+              <w:rPr>
+                <w:rFonts w:ascii="Avenir Next" w:hAnsi="Avenir Next"/>
+                <w:b/>
+                <w:i w:val="0"/>
+                <w:color w:val="FFFFFF"/>
+                <w:sz w:val="18"/>
+              </w:rPr>
+              <w:t>REQUIRED</w:t>
+            </w:r>
+          </w:p>
+        </w:tc>
+        <w:tc>
+          <w:tcPr>
+            <w:tcW w:type="dxa" w:w="1368"/>
+            <w:tcMar>
+              <w:top w:w="40" w:type="dxa"/>
+              <w:left w:w="60" w:type="dxa"/>
+              <w:bottom w:w="40" w:type="dxa"/>
+              <w:right w:w="60" w:type="dxa"/>
+            </w:tcMar>
+            <w:shd w:val="clear" w:color="auto" w:fill="#1A1D26"/>
+            <w:vAlign w:val="center"/>
+          </w:tcPr>
+          <w:p>
+            <w:r>
+              <w:rPr>
+                <w:rFonts w:ascii="Avenir Next" w:hAnsi="Avenir Next"/>
+                <w:b/>
+                <w:i w:val="0"/>
+                <w:color w:val="FFFFFF"/>
+                <w:sz w:val="18"/>
+              </w:rPr>
+              <w:t>GRADED</w:t>
+            </w:r>
+          </w:p>
+        </w:tc>
+        <w:tc>
+          <w:tcPr>
+            <w:tcW w:type="dxa" w:w="1512"/>
+            <w:tcMar>
+              <w:top w:w="40" w:type="dxa"/>
+              <w:left w:w="60" w:type="dxa"/>
+              <w:bottom w:w="40" w:type="dxa"/>
+              <w:right w:w="60" w:type="dxa"/>
+            </w:tcMar>
+            <w:shd w:val="clear" w:color="auto" w:fill="#1A1D26"/>
+            <w:vAlign w:val="center"/>
+          </w:tcPr>
+          <w:p>
+            <w:r>
+              <w:rPr>
+                <w:rFonts w:ascii="Avenir Next" w:hAnsi="Avenir Next"/>
+                <w:b/>
+                <w:i w:val="0"/>
+                <w:color w:val="FFFFFF"/>
+                <w:sz w:val="18"/>
+              </w:rPr>
+              <w:t>WHEN USED</w:t>
+            </w:r>
+          </w:p>
+        </w:tc>
+        <w:tc>
+          <w:tcPr>
+            <w:tcW w:type="dxa" w:w="1152"/>
+            <w:tcMar>
+              <w:top w:w="40" w:type="dxa"/>
+              <w:left w:w="60" w:type="dxa"/>
+              <w:bottom w:w="40" w:type="dxa"/>
+              <w:right w:w="60" w:type="dxa"/>
+            </w:tcMar>
+            <w:shd w:val="clear" w:color="auto" w:fill="#1A1D26"/>
+            <w:vAlign w:val="center"/>
+          </w:tcPr>
+          <w:p>
+            <w:r>
+              <w:rPr>
+                <w:rFonts w:ascii="Avenir Next" w:hAnsi="Avenir Next"/>
+                <w:b/>
+                <w:i w:val="0"/>
+                <w:color w:val="FFFFFF"/>
+                <w:sz w:val="18"/>
+              </w:rPr>
+              <w:t>KEY / ABSENT</w:t>
+            </w:r>
+          </w:p>
+        </w:tc>
+      </w:tr>
+      <w:tr>
+        <w:tc>
+          <w:tcPr>
+            <w:tcW w:type="dxa" w:w="1944"/>
+            <w:tcMar>
+              <w:top w:w="36" w:type="dxa"/>
+              <w:left w:w="60" w:type="dxa"/>
+              <w:bottom w:w="36" w:type="dxa"/>
+              <w:right w:w="60" w:type="dxa"/>
+            </w:tcMar>
+            <w:vAlign w:val="center"/>
+            <w:tcBorders>
+              <w:bottom w:val="single" w:sz="4" w:color="#D8DCE4"/>
+            </w:tcBorders>
+          </w:tcPr>
+          <w:p>
+            <w:r>
+              <w:rPr>
+                <w:rFonts w:ascii="Avenir Next" w:hAnsi="Avenir Next"/>
+                <w:b/>
+                <w:i w:val="0"/>
+                <w:color w:val="1A1D26"/>
+                <w:sz w:val="18"/>
+              </w:rPr>
+              <w:t>Guided Notes (3 pp)</w:t>
+            </w:r>
+          </w:p>
+        </w:tc>
+        <w:tc>
+          <w:tcPr>
+            <w:tcW w:type="dxa" w:w="2736"/>
+            <w:tcMar>
+              <w:top w:w="36" w:type="dxa"/>
+              <w:left w:w="60" w:type="dxa"/>
+              <w:bottom w:w="36" w:type="dxa"/>
+              <w:right w:w="60" w:type="dxa"/>
+            </w:tcMar>
+            <w:vAlign w:val="center"/>
+            <w:tcBorders>
+              <w:bottom w:val="single" w:sz="4" w:color="#D8DCE4"/>
+            </w:tcBorders>
+          </w:tcPr>
+          <w:p>
+            <w:r>
+              <w:rPr>
+                <w:rFonts w:ascii="Avenir Next" w:hAnsi="Avenir Next"/>
+                <w:b w:val="0"/>
+                <w:i w:val="0"/>
+                <w:color w:val="4A5268"/>
+                <w:sz w:val="18"/>
+              </w:rPr>
+              <w:t>01-ch1-energy-causes-change-guided-notes</w:t>
+            </w:r>
+          </w:p>
+        </w:tc>
+        <w:tc>
+          <w:tcPr>
+            <w:tcW w:type="dxa" w:w="1368"/>
+            <w:tcMar>
+              <w:top w:w="36" w:type="dxa"/>
+              <w:left w:w="60" w:type="dxa"/>
+              <w:bottom w:w="36" w:type="dxa"/>
+              <w:right w:w="60" w:type="dxa"/>
+            </w:tcMar>
+            <w:vAlign w:val="center"/>
+            <w:tcBorders>
+              <w:bottom w:val="single" w:sz="4" w:color="#D8DCE4"/>
+            </w:tcBorders>
+          </w:tcPr>
+          <w:p>
+            <w:r>
+              <w:rPr>
+                <w:rFonts w:ascii="Avenir Next" w:hAnsi="Avenir Next"/>
+                <w:b w:val="0"/>
+                <w:i w:val="0"/>
+                <w:color w:val="4A5268"/>
+                <w:sz w:val="18"/>
+              </w:rPr>
+              <w:t>REQUIRED</w:t>
+            </w:r>
+          </w:p>
+        </w:tc>
+        <w:tc>
+          <w:tcPr>
+            <w:tcW w:type="dxa" w:w="1368"/>
+            <w:tcMar>
+              <w:top w:w="36" w:type="dxa"/>
+              <w:left w:w="60" w:type="dxa"/>
+              <w:bottom w:w="36" w:type="dxa"/>
+              <w:right w:w="60" w:type="dxa"/>
+            </w:tcMar>
+            <w:vAlign w:val="center"/>
+            <w:tcBorders>
+              <w:bottom w:val="single" w:sz="4" w:color="#D8DCE4"/>
+            </w:tcBorders>
+          </w:tcPr>
+          <w:p>
+            <w:r>
+              <w:rPr>
+                <w:rFonts w:ascii="Avenir Next" w:hAnsi="Avenir Next"/>
+                <w:b w:val="0"/>
+                <w:i w:val="0"/>
+                <w:color w:val="4A5268"/>
+                <w:sz w:val="18"/>
+              </w:rPr>
+              <w:t>Not graded</w:t>
+            </w:r>
+          </w:p>
+        </w:tc>
+        <w:tc>
+          <w:tcPr>
+            <w:tcW w:type="dxa" w:w="1512"/>
+            <w:tcMar>
+              <w:top w:w="36" w:type="dxa"/>
+              <w:left w:w="60" w:type="dxa"/>
+              <w:bottom w:w="36" w:type="dxa"/>
+              <w:right w:w="60" w:type="dxa"/>
+            </w:tcMar>
+            <w:vAlign w:val="center"/>
+            <w:tcBorders>
+              <w:bottom w:val="single" w:sz="4" w:color="#D8DCE4"/>
+            </w:tcBorders>
+          </w:tcPr>
+          <w:p>
+            <w:r>
+              <w:rPr>
+                <w:rFonts w:ascii="Avenir Next" w:hAnsi="Avenir Next"/>
+                <w:b w:val="0"/>
+                <w:i w:val="0"/>
+                <w:color w:val="4A5268"/>
+                <w:sz w:val="18"/>
+              </w:rPr>
+              <w:t>Blocks 1–2 (notes write)</w:t>
+            </w:r>
+          </w:p>
+        </w:tc>
+        <w:tc>
+          <w:tcPr>
+            <w:tcW w:type="dxa" w:w="1152"/>
+            <w:tcMar>
+              <w:top w:w="36" w:type="dxa"/>
+              <w:left w:w="60" w:type="dxa"/>
+              <w:bottom w:w="36" w:type="dxa"/>
+              <w:right w:w="60" w:type="dxa"/>
+            </w:tcMar>
+            <w:vAlign w:val="center"/>
+            <w:tcBorders>
+              <w:bottom w:val="single" w:sz="4" w:color="#D8DCE4"/>
+            </w:tcBorders>
+          </w:tcPr>
+          <w:p>
+            <w:r>
+              <w:rPr>
+                <w:rFonts w:ascii="Avenir Next" w:hAnsi="Avenir Next"/>
+                <w:b w:val="0"/>
+                <w:i w:val="0"/>
+                <w:color w:val="4A5268"/>
+                <w:sz w:val="18"/>
+              </w:rPr>
+              <w:t>key AVAILABLE</w:t>
+            </w:r>
+          </w:p>
+        </w:tc>
+      </w:tr>
+      <w:tr>
+        <w:tc>
+          <w:tcPr>
+            <w:tcW w:type="dxa" w:w="1944"/>
+            <w:tcMar>
+              <w:top w:w="36" w:type="dxa"/>
+              <w:left w:w="60" w:type="dxa"/>
+              <w:bottom w:w="36" w:type="dxa"/>
+              <w:right w:w="60" w:type="dxa"/>
+            </w:tcMar>
+            <w:vAlign w:val="center"/>
+            <w:tcBorders>
+              <w:bottom w:val="single" w:sz="4" w:color="#D8DCE4"/>
+            </w:tcBorders>
+          </w:tcPr>
+          <w:p>
+            <w:r>
+              <w:rPr>
+                <w:rFonts w:ascii="Avenir Next" w:hAnsi="Avenir Next"/>
+                <w:b/>
+                <w:i w:val="0"/>
+                <w:color w:val="1A1D26"/>
+                <w:sz w:val="18"/>
+              </w:rPr>
+              <w:t>Slideshow (45 slides)</w:t>
+            </w:r>
+          </w:p>
+        </w:tc>
+        <w:tc>
+          <w:tcPr>
+            <w:tcW w:type="dxa" w:w="2736"/>
+            <w:tcMar>
+              <w:top w:w="36" w:type="dxa"/>
+              <w:left w:w="60" w:type="dxa"/>
+              <w:bottom w:w="36" w:type="dxa"/>
+              <w:right w:w="60" w:type="dxa"/>
+            </w:tcMar>
+            <w:vAlign w:val="center"/>
+            <w:tcBorders>
+              <w:bottom w:val="single" w:sz="4" w:color="#D8DCE4"/>
+            </w:tcBorders>
+          </w:tcPr>
+          <w:p>
+            <w:r>
+              <w:rPr>
+                <w:rFonts w:ascii="Avenir Next" w:hAnsi="Avenir Next"/>
+                <w:b w:val="0"/>
+                <w:i w:val="0"/>
+                <w:color w:val="4A5268"/>
+                <w:sz w:val="18"/>
+              </w:rPr>
+              <w:t>01-ch1-energy-causes-change-slides.pptx</w:t>
+            </w:r>
+          </w:p>
+        </w:tc>
+        <w:tc>
+          <w:tcPr>
+            <w:tcW w:type="dxa" w:w="1368"/>
+            <w:tcMar>
+              <w:top w:w="36" w:type="dxa"/>
+              <w:left w:w="60" w:type="dxa"/>
+              <w:bottom w:w="36" w:type="dxa"/>
+              <w:right w:w="60" w:type="dxa"/>
+            </w:tcMar>
+            <w:vAlign w:val="center"/>
+            <w:tcBorders>
+              <w:bottom w:val="single" w:sz="4" w:color="#D8DCE4"/>
+            </w:tcBorders>
+          </w:tcPr>
+          <w:p>
+            <w:r>
+              <w:rPr>
+                <w:rFonts w:ascii="Avenir Next" w:hAnsi="Avenir Next"/>
+                <w:b w:val="0"/>
+                <w:i w:val="0"/>
+                <w:color w:val="4A5268"/>
+                <w:sz w:val="18"/>
+              </w:rPr>
+              <w:t>REQUIRED</w:t>
+            </w:r>
+          </w:p>
+        </w:tc>
+        <w:tc>
+          <w:tcPr>
+            <w:tcW w:type="dxa" w:w="1368"/>
+            <w:tcMar>
+              <w:top w:w="36" w:type="dxa"/>
+              <w:left w:w="60" w:type="dxa"/>
+              <w:bottom w:w="36" w:type="dxa"/>
+              <w:right w:w="60" w:type="dxa"/>
+            </w:tcMar>
+            <w:vAlign w:val="center"/>
+            <w:tcBorders>
+              <w:bottom w:val="single" w:sz="4" w:color="#D8DCE4"/>
+            </w:tcBorders>
+          </w:tcPr>
+          <w:p>
+            <w:r>
+              <w:rPr>
+                <w:rFonts w:ascii="Avenir Next" w:hAnsi="Avenir Next"/>
+                <w:b w:val="0"/>
+                <w:i w:val="0"/>
+                <w:color w:val="4A5268"/>
+                <w:sz w:val="18"/>
+              </w:rPr>
+              <w:t>—</w:t>
+            </w:r>
+          </w:p>
+        </w:tc>
+        <w:tc>
+          <w:tcPr>
+            <w:tcW w:type="dxa" w:w="1512"/>
+            <w:tcMar>
+              <w:top w:w="36" w:type="dxa"/>
+              <w:left w:w="60" w:type="dxa"/>
+              <w:bottom w:w="36" w:type="dxa"/>
+              <w:right w:w="60" w:type="dxa"/>
+            </w:tcMar>
+            <w:vAlign w:val="center"/>
+            <w:tcBorders>
+              <w:bottom w:val="single" w:sz="4" w:color="#D8DCE4"/>
+            </w:tcBorders>
+          </w:tcPr>
+          <w:p>
+            <w:r>
+              <w:rPr>
+                <w:rFonts w:ascii="Avenir Next" w:hAnsi="Avenir Next"/>
+                <w:b w:val="0"/>
+                <w:i w:val="0"/>
+                <w:color w:val="4A5268"/>
+                <w:sz w:val="18"/>
+              </w:rPr>
+              <w:t>Blocks 1–2 + review</w:t>
+            </w:r>
+          </w:p>
+        </w:tc>
+        <w:tc>
+          <w:tcPr>
+            <w:tcW w:type="dxa" w:w="1152"/>
+            <w:tcMar>
+              <w:top w:w="36" w:type="dxa"/>
+              <w:left w:w="60" w:type="dxa"/>
+              <w:bottom w:w="36" w:type="dxa"/>
+              <w:right w:w="60" w:type="dxa"/>
+            </w:tcMar>
+            <w:vAlign w:val="center"/>
+            <w:tcBorders>
+              <w:bottom w:val="single" w:sz="4" w:color="#D8DCE4"/>
+            </w:tcBorders>
+          </w:tcPr>
+          <w:p>
+            <w:r>
+              <w:rPr>
+                <w:rFonts w:ascii="Avenir Next" w:hAnsi="Avenir Next"/>
+                <w:b w:val="0"/>
+                <w:i w:val="0"/>
+                <w:color w:val="4A5268"/>
+                <w:sz w:val="18"/>
+              </w:rPr>
+              <w:t>— (CHECK slides reveal)</w:t>
+            </w:r>
+          </w:p>
+        </w:tc>
+      </w:tr>
+      <w:tr>
+        <w:tc>
+          <w:tcPr>
+            <w:tcW w:type="dxa" w:w="1944"/>
+            <w:tcMar>
+              <w:top w:w="36" w:type="dxa"/>
+              <w:left w:w="60" w:type="dxa"/>
+              <w:bottom w:w="36" w:type="dxa"/>
+              <w:right w:w="60" w:type="dxa"/>
+            </w:tcMar>
+            <w:vAlign w:val="center"/>
+            <w:tcBorders>
+              <w:bottom w:val="single" w:sz="4" w:color="#D8DCE4"/>
+            </w:tcBorders>
+          </w:tcPr>
+          <w:p>
+            <w:r>
+              <w:rPr>
+                <w:rFonts w:ascii="Avenir Next" w:hAnsi="Avenir Next"/>
+                <w:b/>
+                <w:i w:val="0"/>
+                <w:color w:val="1A1D26"/>
+                <w:sz w:val="18"/>
+              </w:rPr>
+              <w:t>Practice / application</w:t>
+            </w:r>
+          </w:p>
+        </w:tc>
+        <w:tc>
+          <w:tcPr>
+            <w:tcW w:type="dxa" w:w="2736"/>
+            <w:tcMar>
+              <w:top w:w="36" w:type="dxa"/>
+              <w:left w:w="60" w:type="dxa"/>
+              <w:bottom w:w="36" w:type="dxa"/>
+              <w:right w:w="60" w:type="dxa"/>
+            </w:tcMar>
+            <w:vAlign w:val="center"/>
+            <w:tcBorders>
+              <w:bottom w:val="single" w:sz="4" w:color="#D8DCE4"/>
+            </w:tcBorders>
+          </w:tcPr>
+          <w:p>
+            <w:r>
+              <w:rPr>
+                <w:rFonts w:ascii="Avenir Next" w:hAnsi="Avenir Next"/>
+                <w:b w:val="0"/>
+                <w:i w:val="0"/>
+                <w:color w:val="4A5268"/>
+                <w:sz w:val="18"/>
+              </w:rPr>
+              <w:t>01-ch1-energy-causes-change-practice.docx</w:t>
+            </w:r>
+          </w:p>
+        </w:tc>
+        <w:tc>
+          <w:tcPr>
+            <w:tcW w:type="dxa" w:w="1368"/>
+            <w:tcMar>
+              <w:top w:w="36" w:type="dxa"/>
+              <w:left w:w="60" w:type="dxa"/>
+              <w:bottom w:w="36" w:type="dxa"/>
+              <w:right w:w="60" w:type="dxa"/>
+            </w:tcMar>
+            <w:vAlign w:val="center"/>
+            <w:tcBorders>
+              <w:bottom w:val="single" w:sz="4" w:color="#D8DCE4"/>
+            </w:tcBorders>
+          </w:tcPr>
+          <w:p>
+            <w:r>
+              <w:rPr>
+                <w:rFonts w:ascii="Avenir Next" w:hAnsi="Avenir Next"/>
+                <w:b w:val="0"/>
+                <w:i w:val="0"/>
+                <w:color w:val="4A5268"/>
+                <w:sz w:val="18"/>
+              </w:rPr>
+              <w:t>REQUIRED</w:t>
+            </w:r>
+          </w:p>
+        </w:tc>
+        <w:tc>
+          <w:tcPr>
+            <w:tcW w:type="dxa" w:w="1368"/>
+            <w:tcMar>
+              <w:top w:w="36" w:type="dxa"/>
+              <w:left w:w="60" w:type="dxa"/>
+              <w:bottom w:w="36" w:type="dxa"/>
+              <w:right w:w="60" w:type="dxa"/>
+            </w:tcMar>
+            <w:vAlign w:val="center"/>
+            <w:tcBorders>
+              <w:bottom w:val="single" w:sz="4" w:color="#D8DCE4"/>
+            </w:tcBorders>
+          </w:tcPr>
+          <w:p>
+            <w:r>
+              <w:rPr>
+                <w:rFonts w:ascii="Avenir Next" w:hAnsi="Avenir Next"/>
+                <w:b w:val="0"/>
+                <w:i w:val="0"/>
+                <w:color w:val="4A5268"/>
+                <w:sz w:val="18"/>
+              </w:rPr>
+              <w:t>Not graded (practice)</w:t>
+            </w:r>
+          </w:p>
+        </w:tc>
+        <w:tc>
+          <w:tcPr>
+            <w:tcW w:type="dxa" w:w="1512"/>
+            <w:tcMar>
+              <w:top w:w="36" w:type="dxa"/>
+              <w:left w:w="60" w:type="dxa"/>
+              <w:bottom w:w="36" w:type="dxa"/>
+              <w:right w:w="60" w:type="dxa"/>
+            </w:tcMar>
+            <w:vAlign w:val="center"/>
+            <w:tcBorders>
+              <w:bottom w:val="single" w:sz="4" w:color="#D8DCE4"/>
+            </w:tcBorders>
+          </w:tcPr>
+          <w:p>
+            <w:r>
+              <w:rPr>
+                <w:rFonts w:ascii="Avenir Next" w:hAnsi="Avenir Next"/>
+                <w:b w:val="0"/>
+                <w:i w:val="0"/>
+                <w:color w:val="4A5268"/>
+                <w:sz w:val="18"/>
+              </w:rPr>
+              <w:t>Block 2 application</w:t>
+            </w:r>
+          </w:p>
+        </w:tc>
+        <w:tc>
+          <w:tcPr>
+            <w:tcW w:type="dxa" w:w="1152"/>
+            <w:tcMar>
+              <w:top w:w="36" w:type="dxa"/>
+              <w:left w:w="60" w:type="dxa"/>
+              <w:bottom w:w="36" w:type="dxa"/>
+              <w:right w:w="60" w:type="dxa"/>
+            </w:tcMar>
+            <w:vAlign w:val="center"/>
+            <w:tcBorders>
+              <w:bottom w:val="single" w:sz="4" w:color="#D8DCE4"/>
+            </w:tcBorders>
+          </w:tcPr>
+          <w:p>
+            <w:r>
+              <w:rPr>
+                <w:rFonts w:ascii="Avenir Next" w:hAnsi="Avenir Next"/>
+                <w:b w:val="0"/>
+                <w:i w:val="0"/>
+                <w:color w:val="4A5268"/>
+                <w:sz w:val="18"/>
+              </w:rPr>
+              <w:t>key AVAILABLE</w:t>
+            </w:r>
+          </w:p>
+        </w:tc>
+      </w:tr>
+      <w:tr>
+        <w:tc>
+          <w:tcPr>
+            <w:tcW w:type="dxa" w:w="1944"/>
+            <w:tcMar>
+              <w:top w:w="36" w:type="dxa"/>
+              <w:left w:w="60" w:type="dxa"/>
+              <w:bottom w:w="36" w:type="dxa"/>
+              <w:right w:w="60" w:type="dxa"/>
+            </w:tcMar>
+            <w:vAlign w:val="center"/>
+            <w:tcBorders>
+              <w:bottom w:val="single" w:sz="4" w:color="#D8DCE4"/>
+            </w:tcBorders>
+          </w:tcPr>
+          <w:p>
+            <w:r>
+              <w:rPr>
+                <w:rFonts w:ascii="Avenir Next" w:hAnsi="Avenir Next"/>
+                <w:b/>
+                <w:i w:val="0"/>
+                <w:color w:val="1A1D26"/>
+                <w:sz w:val="18"/>
+              </w:rPr>
+              <w:t>Chapter quiz (9-item)</w:t>
+            </w:r>
+          </w:p>
+        </w:tc>
+        <w:tc>
+          <w:tcPr>
+            <w:tcW w:type="dxa" w:w="2736"/>
+            <w:tcMar>
+              <w:top w:w="36" w:type="dxa"/>
+              <w:left w:w="60" w:type="dxa"/>
+              <w:bottom w:w="36" w:type="dxa"/>
+              <w:right w:w="60" w:type="dxa"/>
+            </w:tcMar>
+            <w:vAlign w:val="center"/>
+            <w:tcBorders>
+              <w:bottom w:val="single" w:sz="4" w:color="#D8DCE4"/>
+            </w:tcBorders>
+          </w:tcPr>
+          <w:p>
+            <w:r>
+              <w:rPr>
+                <w:rFonts w:ascii="Avenir Next" w:hAnsi="Avenir Next"/>
+                <w:b w:val="0"/>
+                <w:i w:val="0"/>
+                <w:color w:val="4A5268"/>
+                <w:sz w:val="18"/>
+              </w:rPr>
+              <w:t>01-ch1-energy-causes-change-quiz.docx</w:t>
+            </w:r>
+          </w:p>
+        </w:tc>
+        <w:tc>
+          <w:tcPr>
+            <w:tcW w:type="dxa" w:w="1368"/>
+            <w:tcMar>
+              <w:top w:w="36" w:type="dxa"/>
+              <w:left w:w="60" w:type="dxa"/>
+              <w:bottom w:w="36" w:type="dxa"/>
+              <w:right w:w="60" w:type="dxa"/>
+            </w:tcMar>
+            <w:vAlign w:val="center"/>
+            <w:tcBorders>
+              <w:bottom w:val="single" w:sz="4" w:color="#D8DCE4"/>
+            </w:tcBorders>
+          </w:tcPr>
+          <w:p>
+            <w:r>
+              <w:rPr>
+                <w:rFonts w:ascii="Avenir Next" w:hAnsi="Avenir Next"/>
+                <w:b w:val="0"/>
+                <w:i w:val="0"/>
+                <w:color w:val="4A5268"/>
+                <w:sz w:val="18"/>
+              </w:rPr>
+              <w:t>REQUIRED</w:t>
+            </w:r>
+          </w:p>
+        </w:tc>
+        <w:tc>
+          <w:tcPr>
+            <w:tcW w:type="dxa" w:w="1368"/>
+            <w:tcMar>
+              <w:top w:w="36" w:type="dxa"/>
+              <w:left w:w="60" w:type="dxa"/>
+              <w:bottom w:w="36" w:type="dxa"/>
+              <w:right w:w="60" w:type="dxa"/>
+            </w:tcMar>
+            <w:vAlign w:val="center"/>
+            <w:tcBorders>
+              <w:bottom w:val="single" w:sz="4" w:color="#D8DCE4"/>
+            </w:tcBorders>
+          </w:tcPr>
+          <w:p>
+            <w:r>
+              <w:rPr>
+                <w:rFonts w:ascii="Avenir Next" w:hAnsi="Avenir Next"/>
+                <w:b w:val="0"/>
+                <w:i w:val="0"/>
+                <w:color w:val="4A5268"/>
+                <w:sz w:val="18"/>
+              </w:rPr>
+              <w:t>Formative (graded)</w:t>
+            </w:r>
+          </w:p>
+        </w:tc>
+        <w:tc>
+          <w:tcPr>
+            <w:tcW w:type="dxa" w:w="1512"/>
+            <w:tcMar>
+              <w:top w:w="36" w:type="dxa"/>
+              <w:left w:w="60" w:type="dxa"/>
+              <w:bottom w:w="36" w:type="dxa"/>
+              <w:right w:w="60" w:type="dxa"/>
+            </w:tcMar>
+            <w:vAlign w:val="center"/>
+            <w:tcBorders>
+              <w:bottom w:val="single" w:sz="4" w:color="#D8DCE4"/>
+            </w:tcBorders>
+          </w:tcPr>
+          <w:p>
+            <w:r>
+              <w:rPr>
+                <w:rFonts w:ascii="Avenir Next" w:hAnsi="Avenir Next"/>
+                <w:b w:val="0"/>
+                <w:i w:val="0"/>
+                <w:color w:val="4A5268"/>
+                <w:sz w:val="18"/>
+              </w:rPr>
+              <w:t>End of chapter</w:t>
+            </w:r>
+          </w:p>
+        </w:tc>
+        <w:tc>
+          <w:tcPr>
+            <w:tcW w:type="dxa" w:w="1152"/>
+            <w:tcMar>
+              <w:top w:w="36" w:type="dxa"/>
+              <w:left w:w="60" w:type="dxa"/>
+              <w:bottom w:w="36" w:type="dxa"/>
+              <w:right w:w="60" w:type="dxa"/>
+            </w:tcMar>
+            <w:vAlign w:val="center"/>
+            <w:tcBorders>
+              <w:bottom w:val="single" w:sz="4" w:color="#D8DCE4"/>
+            </w:tcBorders>
+          </w:tcPr>
+          <w:p>
+            <w:r>
+              <w:rPr>
+                <w:rFonts w:ascii="Avenir Next" w:hAnsi="Avenir Next"/>
+                <w:b w:val="0"/>
+                <w:i w:val="0"/>
+                <w:color w:val="4A5268"/>
+                <w:sz w:val="18"/>
+              </w:rPr>
+              <w:t>key + blueprint AVAILABLE</w:t>
+            </w:r>
+          </w:p>
+        </w:tc>
+      </w:tr>
+      <w:tr>
+        <w:tc>
+          <w:tcPr>
+            <w:tcW w:type="dxa" w:w="1944"/>
+            <w:tcMar>
+              <w:top w:w="36" w:type="dxa"/>
+              <w:left w:w="60" w:type="dxa"/>
+              <w:bottom w:w="36" w:type="dxa"/>
+              <w:right w:w="60" w:type="dxa"/>
+            </w:tcMar>
+            <w:vAlign w:val="center"/>
+            <w:tcBorders>
+              <w:bottom w:val="single" w:sz="4" w:color="#D8DCE4"/>
+            </w:tcBorders>
+          </w:tcPr>
+          <w:p>
+            <w:r>
+              <w:rPr>
+                <w:rFonts w:ascii="Avenir Next" w:hAnsi="Avenir Next"/>
+                <w:b/>
+                <w:i w:val="0"/>
+                <w:color w:val="1A1D26"/>
+                <w:sz w:val="18"/>
+              </w:rPr>
+              <w:t>Science Journal</w:t>
+            </w:r>
+          </w:p>
+        </w:tc>
+        <w:tc>
+          <w:tcPr>
+            <w:tcW w:type="dxa" w:w="2736"/>
+            <w:tcMar>
+              <w:top w:w="36" w:type="dxa"/>
+              <w:left w:w="60" w:type="dxa"/>
+              <w:bottom w:w="36" w:type="dxa"/>
+              <w:right w:w="60" w:type="dxa"/>
+            </w:tcMar>
+            <w:vAlign w:val="center"/>
+            <w:tcBorders>
+              <w:bottom w:val="single" w:sz="4" w:color="#D8DCE4"/>
+            </w:tcBorders>
+          </w:tcPr>
+          <w:p>
+            <w:r>
+              <w:rPr>
+                <w:rFonts w:ascii="Avenir Next" w:hAnsi="Avenir Next"/>
+                <w:b w:val="0"/>
+                <w:i w:val="0"/>
+                <w:color w:val="4A5268"/>
+                <w:sz w:val="18"/>
+              </w:rPr>
+              <w:t>MASTER_CURRICULUM_MAP.md (2 prompts)</w:t>
+            </w:r>
+          </w:p>
+        </w:tc>
+        <w:tc>
+          <w:tcPr>
+            <w:tcW w:type="dxa" w:w="1368"/>
+            <w:tcMar>
+              <w:top w:w="36" w:type="dxa"/>
+              <w:left w:w="60" w:type="dxa"/>
+              <w:bottom w:w="36" w:type="dxa"/>
+              <w:right w:w="60" w:type="dxa"/>
+            </w:tcMar>
+            <w:vAlign w:val="center"/>
+            <w:tcBorders>
+              <w:bottom w:val="single" w:sz="4" w:color="#D8DCE4"/>
+            </w:tcBorders>
+          </w:tcPr>
+          <w:p>
+            <w:r>
+              <w:rPr>
+                <w:rFonts w:ascii="Avenir Next" w:hAnsi="Avenir Next"/>
+                <w:b w:val="0"/>
+                <w:i w:val="0"/>
+                <w:color w:val="4A5268"/>
+                <w:sz w:val="18"/>
+              </w:rPr>
+              <w:t>OPTIONAL/FLEX</w:t>
+            </w:r>
+          </w:p>
+        </w:tc>
+        <w:tc>
+          <w:tcPr>
+            <w:tcW w:type="dxa" w:w="1368"/>
+            <w:tcMar>
+              <w:top w:w="36" w:type="dxa"/>
+              <w:left w:w="60" w:type="dxa"/>
+              <w:bottom w:w="36" w:type="dxa"/>
+              <w:right w:w="60" w:type="dxa"/>
+            </w:tcMar>
+            <w:vAlign w:val="center"/>
+            <w:tcBorders>
+              <w:bottom w:val="single" w:sz="4" w:color="#D8DCE4"/>
+            </w:tcBorders>
+          </w:tcPr>
+          <w:p>
+            <w:r>
+              <w:rPr>
+                <w:rFonts w:ascii="Avenir Next" w:hAnsi="Avenir Next"/>
+                <w:b w:val="0"/>
+                <w:i w:val="0"/>
+                <w:color w:val="4A5268"/>
+                <w:sz w:val="18"/>
+              </w:rPr>
+              <w:t>Not graded</w:t>
+            </w:r>
+          </w:p>
+        </w:tc>
+        <w:tc>
+          <w:tcPr>
+            <w:tcW w:type="dxa" w:w="1512"/>
+            <w:tcMar>
+              <w:top w:w="36" w:type="dxa"/>
+              <w:left w:w="60" w:type="dxa"/>
+              <w:bottom w:w="36" w:type="dxa"/>
+              <w:right w:w="60" w:type="dxa"/>
+            </w:tcMar>
+            <w:vAlign w:val="center"/>
+            <w:tcBorders>
+              <w:bottom w:val="single" w:sz="4" w:color="#D8DCE4"/>
+            </w:tcBorders>
+          </w:tcPr>
+          <w:p>
+            <w:r>
+              <w:rPr>
+                <w:rFonts w:ascii="Avenir Next" w:hAnsi="Avenir Next"/>
+                <w:b w:val="0"/>
+                <w:i w:val="0"/>
+                <w:color w:val="4A5268"/>
+                <w:sz w:val="18"/>
+              </w:rPr>
+              <w:t>Daily, secondary role</w:t>
+            </w:r>
+          </w:p>
+        </w:tc>
+        <w:tc>
+          <w:tcPr>
+            <w:tcW w:type="dxa" w:w="1152"/>
+            <w:tcMar>
+              <w:top w:w="36" w:type="dxa"/>
+              <w:left w:w="60" w:type="dxa"/>
+              <w:bottom w:w="36" w:type="dxa"/>
+              <w:right w:w="60" w:type="dxa"/>
+            </w:tcMar>
+            <w:vAlign w:val="center"/>
+            <w:tcBorders>
+              <w:bottom w:val="single" w:sz="4" w:color="#D8DCE4"/>
+            </w:tcBorders>
+          </w:tcPr>
+          <w:p>
+            <w:r>
+              <w:rPr>
+                <w:rFonts w:ascii="Avenir Next" w:hAnsi="Avenir Next"/>
+                <w:b w:val="0"/>
+                <w:i w:val="0"/>
+                <w:color w:val="4A5268"/>
+                <w:sz w:val="18"/>
+              </w:rPr>
+              <w:t>— (reflective)</w:t>
+            </w:r>
+          </w:p>
+        </w:tc>
+      </w:tr>
+      <w:tr>
+        <w:tc>
+          <w:tcPr>
+            <w:tcW w:type="dxa" w:w="1944"/>
+            <w:tcMar>
+              <w:top w:w="36" w:type="dxa"/>
+              <w:left w:w="60" w:type="dxa"/>
+              <w:bottom w:w="36" w:type="dxa"/>
+              <w:right w:w="60" w:type="dxa"/>
+            </w:tcMar>
+            <w:vAlign w:val="center"/>
+            <w:tcBorders>
+              <w:bottom w:val="single" w:sz="4" w:color="#D8DCE4"/>
+            </w:tcBorders>
+          </w:tcPr>
+          <w:p>
+            <w:r>
+              <w:rPr>
+                <w:rFonts w:ascii="Avenir Next" w:hAnsi="Avenir Next"/>
+                <w:b/>
+                <w:i w:val="0"/>
+                <w:color w:val="1A1D26"/>
+                <w:sz w:val="18"/>
+              </w:rPr>
+              <w:t>Absent / makeup</w:t>
+            </w:r>
+          </w:p>
+        </w:tc>
+        <w:tc>
+          <w:tcPr>
+            <w:tcW w:type="dxa" w:w="2736"/>
+            <w:tcMar>
+              <w:top w:w="36" w:type="dxa"/>
+              <w:left w:w="60" w:type="dxa"/>
+              <w:bottom w:w="36" w:type="dxa"/>
+              <w:right w:w="60" w:type="dxa"/>
+            </w:tcMar>
+            <w:vAlign w:val="center"/>
+            <w:tcBorders>
+              <w:bottom w:val="single" w:sz="4" w:color="#D8DCE4"/>
+            </w:tcBorders>
+          </w:tcPr>
+          <w:p>
+            <w:r>
+              <w:rPr>
+                <w:rFonts w:ascii="Avenir Next" w:hAnsi="Avenir Next"/>
+                <w:b w:val="0"/>
+                <w:i w:val="0"/>
+                <w:color w:val="4A5268"/>
+                <w:sz w:val="18"/>
+              </w:rPr>
+              <w:t>student/recovery/01-ch1-absent-student-recovery.md</w:t>
+            </w:r>
+          </w:p>
+        </w:tc>
+        <w:tc>
+          <w:tcPr>
+            <w:tcW w:type="dxa" w:w="1368"/>
+            <w:tcMar>
+              <w:top w:w="36" w:type="dxa"/>
+              <w:left w:w="60" w:type="dxa"/>
+              <w:bottom w:w="36" w:type="dxa"/>
+              <w:right w:w="60" w:type="dxa"/>
+            </w:tcMar>
+            <w:vAlign w:val="center"/>
+            <w:tcBorders>
+              <w:bottom w:val="single" w:sz="4" w:color="#D8DCE4"/>
+            </w:tcBorders>
+          </w:tcPr>
+          <w:p>
+            <w:r>
+              <w:rPr>
+                <w:rFonts w:ascii="Avenir Next" w:hAnsi="Avenir Next"/>
+                <w:b w:val="0"/>
+                <w:i w:val="0"/>
+                <w:color w:val="4A5268"/>
+                <w:sz w:val="18"/>
+              </w:rPr>
+              <w:t>REQUIRED (support)</w:t>
+            </w:r>
+          </w:p>
+        </w:tc>
+        <w:tc>
+          <w:tcPr>
+            <w:tcW w:type="dxa" w:w="1368"/>
+            <w:tcMar>
+              <w:top w:w="36" w:type="dxa"/>
+              <w:left w:w="60" w:type="dxa"/>
+              <w:bottom w:w="36" w:type="dxa"/>
+              <w:right w:w="60" w:type="dxa"/>
+            </w:tcMar>
+            <w:vAlign w:val="center"/>
+            <w:tcBorders>
+              <w:bottom w:val="single" w:sz="4" w:color="#D8DCE4"/>
+            </w:tcBorders>
+          </w:tcPr>
+          <w:p>
+            <w:r>
+              <w:rPr>
+                <w:rFonts w:ascii="Avenir Next" w:hAnsi="Avenir Next"/>
+                <w:b w:val="0"/>
+                <w:i w:val="0"/>
+                <w:color w:val="4A5268"/>
+                <w:sz w:val="18"/>
+              </w:rPr>
+              <w:t>Not graded</w:t>
+            </w:r>
+          </w:p>
+        </w:tc>
+        <w:tc>
+          <w:tcPr>
+            <w:tcW w:type="dxa" w:w="1512"/>
+            <w:tcMar>
+              <w:top w:w="36" w:type="dxa"/>
+              <w:left w:w="60" w:type="dxa"/>
+              <w:bottom w:w="36" w:type="dxa"/>
+              <w:right w:w="60" w:type="dxa"/>
+            </w:tcMar>
+            <w:vAlign w:val="center"/>
+            <w:tcBorders>
+              <w:bottom w:val="single" w:sz="4" w:color="#D8DCE4"/>
+            </w:tcBorders>
+          </w:tcPr>
+          <w:p>
+            <w:r>
+              <w:rPr>
+                <w:rFonts w:ascii="Avenir Next" w:hAnsi="Avenir Next"/>
+                <w:b w:val="0"/>
+                <w:i w:val="0"/>
+                <w:color w:val="4A5268"/>
+                <w:sz w:val="18"/>
+              </w:rPr>
+              <w:t>After absence</w:t>
+            </w:r>
+          </w:p>
+        </w:tc>
+        <w:tc>
+          <w:tcPr>
+            <w:tcW w:type="dxa" w:w="1152"/>
+            <w:tcMar>
+              <w:top w:w="36" w:type="dxa"/>
+              <w:left w:w="60" w:type="dxa"/>
+              <w:bottom w:w="36" w:type="dxa"/>
+              <w:right w:w="60" w:type="dxa"/>
+            </w:tcMar>
+            <w:vAlign w:val="center"/>
+            <w:tcBorders>
+              <w:bottom w:val="single" w:sz="4" w:color="#D8DCE4"/>
+            </w:tcBorders>
+          </w:tcPr>
+          <w:p>
+            <w:r>
+              <w:rPr>
+                <w:rFonts w:ascii="Avenir Next" w:hAnsi="Avenir Next"/>
+                <w:b w:val="0"/>
+                <w:i w:val="0"/>
+                <w:color w:val="4A5268"/>
+                <w:sz w:val="18"/>
+              </w:rPr>
+              <w:t>self-contained</w:t>
+            </w:r>
+          </w:p>
+        </w:tc>
+      </w:tr>
+      <w:tr>
+        <w:tc>
+          <w:tcPr>
+            <w:tcW w:type="dxa" w:w="1944"/>
+            <w:tcMar>
+              <w:top w:w="36" w:type="dxa"/>
+              <w:left w:w="60" w:type="dxa"/>
+              <w:bottom w:w="36" w:type="dxa"/>
+              <w:right w:w="60" w:type="dxa"/>
+            </w:tcMar>
+            <w:vAlign w:val="center"/>
+            <w:tcBorders>
+              <w:bottom w:val="single" w:sz="4" w:color="#D8DCE4"/>
+            </w:tcBorders>
+          </w:tcPr>
+          <w:p>
+            <w:r>
+              <w:rPr>
+                <w:rFonts w:ascii="Avenir Next" w:hAnsi="Avenir Next"/>
+                <w:b/>
+                <w:i w:val="0"/>
+                <w:color w:val="1A1D26"/>
+                <w:sz w:val="18"/>
+              </w:rPr>
+              <w:t>Energy Detectives</w:t>
+            </w:r>
+          </w:p>
+        </w:tc>
+        <w:tc>
+          <w:tcPr>
+            <w:tcW w:type="dxa" w:w="2736"/>
+            <w:tcMar>
+              <w:top w:w="36" w:type="dxa"/>
+              <w:left w:w="60" w:type="dxa"/>
+              <w:bottom w:w="36" w:type="dxa"/>
+              <w:right w:w="60" w:type="dxa"/>
+            </w:tcMar>
+            <w:vAlign w:val="center"/>
+            <w:tcBorders>
+              <w:bottom w:val="single" w:sz="4" w:color="#D8DCE4"/>
+            </w:tcBorders>
+          </w:tcPr>
+          <w:p>
+            <w:r>
+              <w:rPr>
+                <w:rFonts w:ascii="Avenir Next" w:hAnsi="Avenir Next"/>
+                <w:b w:val="0"/>
+                <w:i w:val="0"/>
+                <w:color w:val="4A5268"/>
+                <w:sz w:val="18"/>
+              </w:rPr>
+              <w:t>01-ch1-energy-detectives-student.docx</w:t>
+            </w:r>
+          </w:p>
+        </w:tc>
+        <w:tc>
+          <w:tcPr>
+            <w:tcW w:type="dxa" w:w="1368"/>
+            <w:tcMar>
+              <w:top w:w="36" w:type="dxa"/>
+              <w:left w:w="60" w:type="dxa"/>
+              <w:bottom w:w="36" w:type="dxa"/>
+              <w:right w:w="60" w:type="dxa"/>
+            </w:tcMar>
+            <w:vAlign w:val="center"/>
+            <w:tcBorders>
+              <w:bottom w:val="single" w:sz="4" w:color="#D8DCE4"/>
+            </w:tcBorders>
+          </w:tcPr>
+          <w:p>
+            <w:r>
+              <w:rPr>
+                <w:rFonts w:ascii="Avenir Next" w:hAnsi="Avenir Next"/>
+                <w:b w:val="0"/>
+                <w:i w:val="0"/>
+                <w:color w:val="4A5268"/>
+                <w:sz w:val="18"/>
+              </w:rPr>
+              <w:t>OPTIONAL/FLEX</w:t>
+            </w:r>
+          </w:p>
+        </w:tc>
+        <w:tc>
+          <w:tcPr>
+            <w:tcW w:type="dxa" w:w="1368"/>
+            <w:tcMar>
+              <w:top w:w="36" w:type="dxa"/>
+              <w:left w:w="60" w:type="dxa"/>
+              <w:bottom w:w="36" w:type="dxa"/>
+              <w:right w:w="60" w:type="dxa"/>
+            </w:tcMar>
+            <w:vAlign w:val="center"/>
+            <w:tcBorders>
+              <w:bottom w:val="single" w:sz="4" w:color="#D8DCE4"/>
+            </w:tcBorders>
+          </w:tcPr>
+          <w:p>
+            <w:r>
+              <w:rPr>
+                <w:rFonts w:ascii="Avenir Next" w:hAnsi="Avenir Next"/>
+                <w:b w:val="0"/>
+                <w:i w:val="0"/>
+                <w:color w:val="4A5268"/>
+                <w:sz w:val="18"/>
+              </w:rPr>
+              <w:t>Not graded</w:t>
+            </w:r>
+          </w:p>
+        </w:tc>
+        <w:tc>
+          <w:tcPr>
+            <w:tcW w:type="dxa" w:w="1512"/>
+            <w:tcMar>
+              <w:top w:w="36" w:type="dxa"/>
+              <w:left w:w="60" w:type="dxa"/>
+              <w:bottom w:w="36" w:type="dxa"/>
+              <w:right w:w="60" w:type="dxa"/>
+            </w:tcMar>
+            <w:vAlign w:val="center"/>
+            <w:tcBorders>
+              <w:bottom w:val="single" w:sz="4" w:color="#D8DCE4"/>
+            </w:tcBorders>
+          </w:tcPr>
+          <w:p>
+            <w:r>
+              <w:rPr>
+                <w:rFonts w:ascii="Avenir Next" w:hAnsi="Avenir Next"/>
+                <w:b w:val="0"/>
+                <w:i w:val="0"/>
+                <w:color w:val="4A5268"/>
+                <w:sz w:val="18"/>
+              </w:rPr>
+              <w:t>Friday FLEX</w:t>
+            </w:r>
+          </w:p>
+        </w:tc>
+        <w:tc>
+          <w:tcPr>
+            <w:tcW w:type="dxa" w:w="1152"/>
+            <w:tcMar>
+              <w:top w:w="36" w:type="dxa"/>
+              <w:left w:w="60" w:type="dxa"/>
+              <w:bottom w:w="36" w:type="dxa"/>
+              <w:right w:w="60" w:type="dxa"/>
+            </w:tcMar>
+            <w:vAlign w:val="center"/>
+            <w:tcBorders>
+              <w:bottom w:val="single" w:sz="4" w:color="#D8DCE4"/>
+            </w:tcBorders>
+          </w:tcPr>
+          <w:p>
+            <w:r>
+              <w:rPr>
+                <w:rFonts w:ascii="Avenir Next" w:hAnsi="Avenir Next"/>
+                <w:b w:val="0"/>
+                <w:i w:val="0"/>
+                <w:color w:val="4A5268"/>
+                <w:sz w:val="18"/>
+              </w:rPr>
+              <w:t>key AVAILABLE</w:t>
+            </w:r>
+          </w:p>
+        </w:tc>
+      </w:tr>
+      <w:tr>
+        <w:tc>
+          <w:tcPr>
+            <w:tcW w:type="dxa" w:w="1944"/>
+            <w:tcMar>
+              <w:top w:w="36" w:type="dxa"/>
+              <w:left w:w="60" w:type="dxa"/>
+              <w:bottom w:w="36" w:type="dxa"/>
+              <w:right w:w="60" w:type="dxa"/>
+            </w:tcMar>
+            <w:vAlign w:val="center"/>
+            <w:tcBorders>
+              <w:bottom w:val="single" w:sz="4" w:color="#D8DCE4"/>
+            </w:tcBorders>
+          </w:tcPr>
+          <w:p>
+            <w:r>
+              <w:rPr>
+                <w:rFonts w:ascii="Avenir Next" w:hAnsi="Avenir Next"/>
+                <w:b/>
+                <w:i w:val="0"/>
+                <w:color w:val="1A1D26"/>
+                <w:sz w:val="18"/>
+              </w:rPr>
+              <w:t>Friday FLEX</w:t>
+            </w:r>
+          </w:p>
+        </w:tc>
+        <w:tc>
+          <w:tcPr>
+            <w:tcW w:type="dxa" w:w="2736"/>
+            <w:tcMar>
+              <w:top w:w="36" w:type="dxa"/>
+              <w:left w:w="60" w:type="dxa"/>
+              <w:bottom w:w="36" w:type="dxa"/>
+              <w:right w:w="60" w:type="dxa"/>
+            </w:tcMar>
+            <w:vAlign w:val="center"/>
+            <w:tcBorders>
+              <w:bottom w:val="single" w:sz="4" w:color="#D8DCE4"/>
+            </w:tcBorders>
+          </w:tcPr>
+          <w:p>
+            <w:r>
+              <w:rPr>
+                <w:rFonts w:ascii="Avenir Next" w:hAnsi="Avenir Next"/>
+                <w:b w:val="0"/>
+                <w:i w:val="0"/>
+                <w:color w:val="4A5268"/>
+                <w:sz w:val="18"/>
+              </w:rPr>
+              <w:t>student/01-ch1-friday-flex.md</w:t>
+            </w:r>
+          </w:p>
+        </w:tc>
+        <w:tc>
+          <w:tcPr>
+            <w:tcW w:type="dxa" w:w="1368"/>
+            <w:tcMar>
+              <w:top w:w="36" w:type="dxa"/>
+              <w:left w:w="60" w:type="dxa"/>
+              <w:bottom w:w="36" w:type="dxa"/>
+              <w:right w:w="60" w:type="dxa"/>
+            </w:tcMar>
+            <w:vAlign w:val="center"/>
+            <w:tcBorders>
+              <w:bottom w:val="single" w:sz="4" w:color="#D8DCE4"/>
+            </w:tcBorders>
+          </w:tcPr>
+          <w:p>
+            <w:r>
+              <w:rPr>
+                <w:rFonts w:ascii="Avenir Next" w:hAnsi="Avenir Next"/>
+                <w:b w:val="0"/>
+                <w:i w:val="0"/>
+                <w:color w:val="4A5268"/>
+                <w:sz w:val="18"/>
+              </w:rPr>
+              <w:t>OPTIONAL/FLEX</w:t>
+            </w:r>
+          </w:p>
+        </w:tc>
+        <w:tc>
+          <w:tcPr>
+            <w:tcW w:type="dxa" w:w="1368"/>
+            <w:tcMar>
+              <w:top w:w="36" w:type="dxa"/>
+              <w:left w:w="60" w:type="dxa"/>
+              <w:bottom w:w="36" w:type="dxa"/>
+              <w:right w:w="60" w:type="dxa"/>
+            </w:tcMar>
+            <w:vAlign w:val="center"/>
+            <w:tcBorders>
+              <w:bottom w:val="single" w:sz="4" w:color="#D8DCE4"/>
+            </w:tcBorders>
+          </w:tcPr>
+          <w:p>
+            <w:r>
+              <w:rPr>
+                <w:rFonts w:ascii="Avenir Next" w:hAnsi="Avenir Next"/>
+                <w:b w:val="0"/>
+                <w:i w:val="0"/>
+                <w:color w:val="4A5268"/>
+                <w:sz w:val="18"/>
+              </w:rPr>
+              <w:t>Not graded</w:t>
+            </w:r>
+          </w:p>
+        </w:tc>
+        <w:tc>
+          <w:tcPr>
+            <w:tcW w:type="dxa" w:w="1512"/>
+            <w:tcMar>
+              <w:top w:w="36" w:type="dxa"/>
+              <w:left w:w="60" w:type="dxa"/>
+              <w:bottom w:w="36" w:type="dxa"/>
+              <w:right w:w="60" w:type="dxa"/>
+            </w:tcMar>
+            <w:vAlign w:val="center"/>
+            <w:tcBorders>
+              <w:bottom w:val="single" w:sz="4" w:color="#D8DCE4"/>
+            </w:tcBorders>
+          </w:tcPr>
+          <w:p>
+            <w:r>
+              <w:rPr>
+                <w:rFonts w:ascii="Avenir Next" w:hAnsi="Avenir Next"/>
+                <w:b w:val="0"/>
+                <w:i w:val="0"/>
+                <w:color w:val="4A5268"/>
+                <w:sz w:val="18"/>
+              </w:rPr>
+              <w:t>Friday</w:t>
+            </w:r>
+          </w:p>
+        </w:tc>
+        <w:tc>
+          <w:tcPr>
+            <w:tcW w:type="dxa" w:w="1152"/>
+            <w:tcMar>
+              <w:top w:w="36" w:type="dxa"/>
+              <w:left w:w="60" w:type="dxa"/>
+              <w:bottom w:w="36" w:type="dxa"/>
+              <w:right w:w="60" w:type="dxa"/>
+            </w:tcMar>
+            <w:vAlign w:val="center"/>
+            <w:tcBorders>
+              <w:bottom w:val="single" w:sz="4" w:color="#D8DCE4"/>
+            </w:tcBorders>
+          </w:tcPr>
+          <w:p>
+            <w:r>
+              <w:rPr>
+                <w:rFonts w:ascii="Avenir Next" w:hAnsi="Avenir Next"/>
+                <w:b w:val="0"/>
+                <w:i w:val="0"/>
+                <w:color w:val="4A5268"/>
+                <w:sz w:val="18"/>
+              </w:rPr>
+              <w:t>—</w:t>
+            </w:r>
+          </w:p>
+        </w:tc>
+      </w:tr>
+      <w:tr>
+        <w:tc>
+          <w:tcPr>
+            <w:tcW w:type="dxa" w:w="1944"/>
+            <w:tcMar>
+              <w:top w:w="36" w:type="dxa"/>
+              <w:left w:w="60" w:type="dxa"/>
+              <w:bottom w:w="36" w:type="dxa"/>
+              <w:right w:w="60" w:type="dxa"/>
+            </w:tcMar>
+            <w:vAlign w:val="center"/>
+            <w:tcBorders>
+              <w:bottom w:val="single" w:sz="4" w:color="#D8DCE4"/>
+            </w:tcBorders>
+          </w:tcPr>
+          <w:p>
+            <w:r>
+              <w:rPr>
+                <w:rFonts w:ascii="Avenir Next" w:hAnsi="Avenir Next"/>
+                <w:b/>
+                <w:i w:val="0"/>
+                <w:color w:val="1A1D26"/>
+                <w:sz w:val="18"/>
+              </w:rPr>
+              <w:t>Study-guide contribution</w:t>
+            </w:r>
+          </w:p>
+        </w:tc>
+        <w:tc>
+          <w:tcPr>
+            <w:tcW w:type="dxa" w:w="2736"/>
+            <w:tcMar>
+              <w:top w:w="36" w:type="dxa"/>
+              <w:left w:w="60" w:type="dxa"/>
+              <w:bottom w:w="36" w:type="dxa"/>
+              <w:right w:w="60" w:type="dxa"/>
+            </w:tcMar>
+            <w:vAlign w:val="center"/>
+            <w:tcBorders>
+              <w:bottom w:val="single" w:sz="4" w:color="#D8DCE4"/>
+            </w:tcBorders>
+          </w:tcPr>
+          <w:p>
+            <w:r>
+              <w:rPr>
+                <w:rFonts w:ascii="Avenir Next" w:hAnsi="Avenir Next"/>
+                <w:b w:val="0"/>
+                <w:i w:val="0"/>
+                <w:color w:val="4A5268"/>
+                <w:sz w:val="18"/>
+              </w:rPr>
+              <w:t>docs/chapter-01/CH1_STUDY_GUIDE_CONTRIBUTION.md</w:t>
+            </w:r>
+          </w:p>
+        </w:tc>
+        <w:tc>
+          <w:tcPr>
+            <w:tcW w:type="dxa" w:w="1368"/>
+            <w:tcMar>
+              <w:top w:w="36" w:type="dxa"/>
+              <w:left w:w="60" w:type="dxa"/>
+              <w:bottom w:w="36" w:type="dxa"/>
+              <w:right w:w="60" w:type="dxa"/>
+            </w:tcMar>
+            <w:vAlign w:val="center"/>
+            <w:tcBorders>
+              <w:bottom w:val="single" w:sz="4" w:color="#D8DCE4"/>
+            </w:tcBorders>
+          </w:tcPr>
+          <w:p>
+            <w:r>
+              <w:rPr>
+                <w:rFonts w:ascii="Avenir Next" w:hAnsi="Avenir Next"/>
+                <w:b w:val="0"/>
+                <w:i w:val="0"/>
+                <w:color w:val="4A5268"/>
+                <w:sz w:val="18"/>
+              </w:rPr>
+              <w:t>REFERENCE</w:t>
+            </w:r>
+          </w:p>
+        </w:tc>
+        <w:tc>
+          <w:tcPr>
+            <w:tcW w:type="dxa" w:w="1368"/>
+            <w:tcMar>
+              <w:top w:w="36" w:type="dxa"/>
+              <w:left w:w="60" w:type="dxa"/>
+              <w:bottom w:w="36" w:type="dxa"/>
+              <w:right w:w="60" w:type="dxa"/>
+            </w:tcMar>
+            <w:vAlign w:val="center"/>
+            <w:tcBorders>
+              <w:bottom w:val="single" w:sz="4" w:color="#D8DCE4"/>
+            </w:tcBorders>
+          </w:tcPr>
+          <w:p>
+            <w:r>
+              <w:rPr>
+                <w:rFonts w:ascii="Avenir Next" w:hAnsi="Avenir Next"/>
+                <w:b w:val="0"/>
+                <w:i w:val="0"/>
+                <w:color w:val="4A5268"/>
+                <w:sz w:val="18"/>
+              </w:rPr>
+              <w:t>—</w:t>
+            </w:r>
+          </w:p>
+        </w:tc>
+        <w:tc>
+          <w:tcPr>
+            <w:tcW w:type="dxa" w:w="1512"/>
+            <w:tcMar>
+              <w:top w:w="36" w:type="dxa"/>
+              <w:left w:w="60" w:type="dxa"/>
+              <w:bottom w:w="36" w:type="dxa"/>
+              <w:right w:w="60" w:type="dxa"/>
+            </w:tcMar>
+            <w:vAlign w:val="center"/>
+            <w:tcBorders>
+              <w:bottom w:val="single" w:sz="4" w:color="#D8DCE4"/>
+            </w:tcBorders>
+          </w:tcPr>
+          <w:p>
+            <w:r>
+              <w:rPr>
+                <w:rFonts w:ascii="Avenir Next" w:hAnsi="Avenir Next"/>
+                <w:b w:val="0"/>
+                <w:i w:val="0"/>
+                <w:color w:val="4A5268"/>
+                <w:sz w:val="18"/>
+              </w:rPr>
+              <w:t>Unit assembly</w:t>
+            </w:r>
+          </w:p>
+        </w:tc>
+        <w:tc>
+          <w:tcPr>
+            <w:tcW w:type="dxa" w:w="1152"/>
+            <w:tcMar>
+              <w:top w:w="36" w:type="dxa"/>
+              <w:left w:w="60" w:type="dxa"/>
+              <w:bottom w:w="36" w:type="dxa"/>
+              <w:right w:w="60" w:type="dxa"/>
+            </w:tcMar>
+            <w:vAlign w:val="center"/>
+            <w:tcBorders>
+              <w:bottom w:val="single" w:sz="4" w:color="#D8DCE4"/>
+            </w:tcBorders>
+          </w:tcPr>
+          <w:p>
+            <w:r>
+              <w:rPr>
+                <w:rFonts w:ascii="Avenir Next" w:hAnsi="Avenir Next"/>
+                <w:b w:val="0"/>
+                <w:i w:val="0"/>
+                <w:color w:val="4A5268"/>
+                <w:sz w:val="18"/>
+              </w:rPr>
+              <w:t>—</w:t>
+            </w:r>
+          </w:p>
+        </w:tc>
+      </w:tr>
+      <w:tr>
+        <w:tc>
+          <w:tcPr>
+            <w:tcW w:type="dxa" w:w="1944"/>
+            <w:tcMar>
+              <w:top w:w="36" w:type="dxa"/>
+              <w:left w:w="60" w:type="dxa"/>
+              <w:bottom w:w="36" w:type="dxa"/>
+              <w:right w:w="60" w:type="dxa"/>
+            </w:tcMar>
+            <w:vAlign w:val="center"/>
+            <w:tcBorders>
+              <w:bottom w:val="single" w:sz="4" w:color="#D8DCE4"/>
+            </w:tcBorders>
+          </w:tcPr>
+          <w:p>
+            <w:r>
+              <w:rPr>
+                <w:rFonts w:ascii="Avenir Next" w:hAnsi="Avenir Next"/>
+                <w:b/>
+                <w:i w:val="0"/>
+                <w:color w:val="1A1D26"/>
+                <w:sz w:val="18"/>
+              </w:rPr>
+              <w:t>Assessment trace</w:t>
+            </w:r>
+          </w:p>
+        </w:tc>
+        <w:tc>
+          <w:tcPr>
+            <w:tcW w:type="dxa" w:w="2736"/>
+            <w:tcMar>
+              <w:top w:w="36" w:type="dxa"/>
+              <w:left w:w="60" w:type="dxa"/>
+              <w:bottom w:w="36" w:type="dxa"/>
+              <w:right w:w="60" w:type="dxa"/>
+            </w:tcMar>
+            <w:vAlign w:val="center"/>
+            <w:tcBorders>
+              <w:bottom w:val="single" w:sz="4" w:color="#D8DCE4"/>
+            </w:tcBorders>
+          </w:tcPr>
+          <w:p>
+            <w:r>
+              <w:rPr>
+                <w:rFonts w:ascii="Avenir Next" w:hAnsi="Avenir Next"/>
+                <w:b w:val="0"/>
+                <w:i w:val="0"/>
+                <w:color w:val="4A5268"/>
+                <w:sz w:val="18"/>
+              </w:rPr>
+              <w:t>docs/chapter-01/CH1_ASSESSMENT_TRACE.md</w:t>
+            </w:r>
+          </w:p>
+        </w:tc>
+        <w:tc>
+          <w:tcPr>
+            <w:tcW w:type="dxa" w:w="1368"/>
+            <w:tcMar>
+              <w:top w:w="36" w:type="dxa"/>
+              <w:left w:w="60" w:type="dxa"/>
+              <w:bottom w:w="36" w:type="dxa"/>
+              <w:right w:w="60" w:type="dxa"/>
+            </w:tcMar>
+            <w:vAlign w:val="center"/>
+            <w:tcBorders>
+              <w:bottom w:val="single" w:sz="4" w:color="#D8DCE4"/>
+            </w:tcBorders>
+          </w:tcPr>
+          <w:p>
+            <w:r>
+              <w:rPr>
+                <w:rFonts w:ascii="Avenir Next" w:hAnsi="Avenir Next"/>
+                <w:b w:val="0"/>
+                <w:i w:val="0"/>
+                <w:color w:val="4A5268"/>
+                <w:sz w:val="18"/>
+              </w:rPr>
+              <w:t>REFERENCE</w:t>
+            </w:r>
+          </w:p>
+        </w:tc>
+        <w:tc>
+          <w:tcPr>
+            <w:tcW w:type="dxa" w:w="1368"/>
+            <w:tcMar>
+              <w:top w:w="36" w:type="dxa"/>
+              <w:left w:w="60" w:type="dxa"/>
+              <w:bottom w:w="36" w:type="dxa"/>
+              <w:right w:w="60" w:type="dxa"/>
+            </w:tcMar>
+            <w:vAlign w:val="center"/>
+            <w:tcBorders>
+              <w:bottom w:val="single" w:sz="4" w:color="#D8DCE4"/>
+            </w:tcBorders>
+          </w:tcPr>
+          <w:p>
+            <w:r>
+              <w:rPr>
+                <w:rFonts w:ascii="Avenir Next" w:hAnsi="Avenir Next"/>
+                <w:b w:val="0"/>
+                <w:i w:val="0"/>
+                <w:color w:val="4A5268"/>
+                <w:sz w:val="18"/>
+              </w:rPr>
+              <w:t>—</w:t>
+            </w:r>
+          </w:p>
+        </w:tc>
+        <w:tc>
+          <w:tcPr>
+            <w:tcW w:type="dxa" w:w="1512"/>
+            <w:tcMar>
+              <w:top w:w="36" w:type="dxa"/>
+              <w:left w:w="60" w:type="dxa"/>
+              <w:bottom w:w="36" w:type="dxa"/>
+              <w:right w:w="60" w:type="dxa"/>
+            </w:tcMar>
+            <w:vAlign w:val="center"/>
+            <w:tcBorders>
+              <w:bottom w:val="single" w:sz="4" w:color="#D8DCE4"/>
+            </w:tcBorders>
+          </w:tcPr>
+          <w:p>
+            <w:r>
+              <w:rPr>
+                <w:rFonts w:ascii="Avenir Next" w:hAnsi="Avenir Next"/>
+                <w:b w:val="0"/>
+                <w:i w:val="0"/>
+                <w:color w:val="4A5268"/>
+                <w:sz w:val="18"/>
+              </w:rPr>
+              <w:t>Unit assembly</w:t>
+            </w:r>
+          </w:p>
+        </w:tc>
+        <w:tc>
+          <w:tcPr>
+            <w:tcW w:type="dxa" w:w="1152"/>
+            <w:tcMar>
+              <w:top w:w="36" w:type="dxa"/>
+              <w:left w:w="60" w:type="dxa"/>
+              <w:bottom w:w="36" w:type="dxa"/>
+              <w:right w:w="60" w:type="dxa"/>
+            </w:tcMar>
+            <w:vAlign w:val="center"/>
+            <w:tcBorders>
+              <w:bottom w:val="single" w:sz="4" w:color="#D8DCE4"/>
+            </w:tcBorders>
+          </w:tcPr>
+          <w:p>
+            <w:r>
+              <w:rPr>
+                <w:rFonts w:ascii="Avenir Next" w:hAnsi="Avenir Next"/>
+                <w:b w:val="0"/>
+                <w:i w:val="0"/>
+                <w:color w:val="4A5268"/>
+                <w:sz w:val="18"/>
+              </w:rPr>
+              <w:t>—</w:t>
+            </w:r>
+          </w:p>
+        </w:tc>
+      </w:tr>
+    </w:tbl>
+    <w:tbl>
+      <w:tblPr>
+        <w:tblW w:type="auto" w:w="0"/>
+        <w:tblLook w:firstColumn="1" w:firstRow="1" w:lastColumn="0" w:lastRow="0" w:noHBand="0" w:noVBand="1" w:val="04A0"/>
+        <w:tblBorders>
+          <w:top w:val="none"/>
+          <w:left w:val="none"/>
+          <w:bottom w:val="none"/>
+          <w:right w:val="none"/>
+          <w:insideH w:val="none"/>
+          <w:insideV w:val="none"/>
+        </w:tblBorders>
+      </w:tblPr>
+      <w:tblGrid>
+        <w:gridCol w:w="10080"/>
+      </w:tblGrid>
+      <w:tr>
+        <w:tc>
+          <w:tcPr>
+            <w:tcW w:type="dxa" w:w="10080"/>
+            <w:tcMar>
+              <w:top w:w="60" w:type="dxa"/>
+              <w:left w:w="110" w:type="dxa"/>
+              <w:bottom w:w="60" w:type="dxa"/>
+              <w:right w:w="110" w:type="dxa"/>
+            </w:tcMar>
+            <w:shd w:val="clear" w:color="auto" w:fill="#F6F7F9"/>
+            <w:tcBorders>
+              <w:left w:val="single" w:sz="18" w:color="#1F2A5A"/>
+            </w:tcBorders>
+          </w:tcPr>
+          <w:p>
+            <w:r>
+              <w:rPr>
+                <w:rFonts w:ascii="Avenir Next" w:hAnsi="Avenir Next"/>
+                <w:b/>
+                <w:i w:val="0"/>
+                <w:color w:val="1F2A5A"/>
+                <w:sz w:val="21"/>
+              </w:rPr>
+              <w:t xml:space="preserve">LEAN   </w:t>
+            </w:r>
+            <w:r>
+              <w:rPr>
+                <w:rFonts w:ascii="Avenir Next" w:hAnsi="Avenir Next"/>
+                <w:b w:val="0"/>
+                <w:i w:val="0"/>
+                <w:color w:val="1A1D26"/>
+                <w:sz w:val="21"/>
+              </w:rPr>
+              <w:t>No new student handout or teacher key was created in Phase 5. The practice page is a distinct APPLY task (evidence judgment, not note recopy), so it is kept. Science Journal is already covered by two daily prompts. Energy Detectives is reclassified OPTIONAL/FLEX.</w:t>
+            </w:r>
+          </w:p>
+        </w:tc>
+      </w:tr>
+    </w:tbl>
+    <w:p>
+      <w:r>
+        <w:br w:type="page"/>
+      </w:r>
+    </w:p>
+    <w:p>
+      <w:pPr>
+        <w:spacing w:before="2400" w:after="600"/>
+        <w:pBdr>
+          <w:bottom w:val="single" w:sz="10" w:color="#1A1D26"/>
+        </w:pBdr>
+      </w:pPr>
+      <w:r>
+        <w:rPr>
+          <w:rFonts w:ascii="Avenir Next" w:hAnsi="Avenir Next"/>
+          <w:b/>
+          <w:i w:val="0"/>
           <w:color w:val="1A1D26"/>
           <w:sz w:val="28"/>
         </w:rPr>
@@ -18251,6 +20537,89 @@
                 <w:sz w:val="18"/>
               </w:rPr>
               <w:t>AVAILABLE (FINAL · 3 pp)</w:t>
+            </w:r>
+          </w:p>
+        </w:tc>
+      </w:tr>
+      <w:tr>
+        <w:tc>
+          <w:tcPr>
+            <w:tcW w:type="dxa" w:w="2448"/>
+            <w:tcMar>
+              <w:top w:w="36" w:type="dxa"/>
+              <w:left w:w="60" w:type="dxa"/>
+              <w:bottom w:w="36" w:type="dxa"/>
+              <w:right w:w="60" w:type="dxa"/>
+            </w:tcMar>
+            <w:vAlign w:val="center"/>
+            <w:tcBorders>
+              <w:bottom w:val="single" w:sz="4" w:color="#D8DCE4"/>
+            </w:tcBorders>
+          </w:tcPr>
+          <w:p>
+            <w:r>
+              <w:rPr>
+                <w:rFonts w:ascii="Avenir Next" w:hAnsi="Avenir Next"/>
+                <w:b/>
+                <w:i w:val="0"/>
+                <w:color w:val="1A1D26"/>
+                <w:sz w:val="18"/>
+              </w:rPr>
+              <w:t>Ch1 Energy Detectives key</w:t>
+            </w:r>
+          </w:p>
+        </w:tc>
+        <w:tc>
+          <w:tcPr>
+            <w:tcW w:type="dxa" w:w="4176"/>
+            <w:tcMar>
+              <w:top w:w="36" w:type="dxa"/>
+              <w:left w:w="60" w:type="dxa"/>
+              <w:bottom w:w="36" w:type="dxa"/>
+              <w:right w:w="60" w:type="dxa"/>
+            </w:tcMar>
+            <w:vAlign w:val="center"/>
+            <w:tcBorders>
+              <w:bottom w:val="single" w:sz="4" w:color="#D8DCE4"/>
+            </w:tcBorders>
+          </w:tcPr>
+          <w:p>
+            <w:r>
+              <w:rPr>
+                <w:rFonts w:ascii="Avenir Next" w:hAnsi="Avenir Next"/>
+                <w:b w:val="0"/>
+                <w:i w:val="0"/>
+                <w:color w:val="4A5268"/>
+                <w:sz w:val="18"/>
+              </w:rPr>
+              <w:t>01-ch1-energy-detectives-key</w:t>
+            </w:r>
+          </w:p>
+        </w:tc>
+        <w:tc>
+          <w:tcPr>
+            <w:tcW w:type="dxa" w:w="3456"/>
+            <w:tcMar>
+              <w:top w:w="36" w:type="dxa"/>
+              <w:left w:w="60" w:type="dxa"/>
+              <w:bottom w:w="36" w:type="dxa"/>
+              <w:right w:w="60" w:type="dxa"/>
+            </w:tcMar>
+            <w:vAlign w:val="center"/>
+            <w:tcBorders>
+              <w:bottom w:val="single" w:sz="4" w:color="#D8DCE4"/>
+            </w:tcBorders>
+          </w:tcPr>
+          <w:p>
+            <w:r>
+              <w:rPr>
+                <w:rFonts w:ascii="Avenir Next" w:hAnsi="Avenir Next"/>
+                <w:b w:val="0"/>
+                <w:i w:val="0"/>
+                <w:color w:val="4A5268"/>
+                <w:sz w:val="18"/>
+              </w:rPr>
+              <w:t>AVAILABLE (OPTIONAL/FLEX)</w:t>
             </w:r>
           </w:p>
         </w:tc>
@@ -19342,7 +21711,7 @@
                 <w:color w:val="4A5268"/>
                 <w:sz w:val="18"/>
               </w:rPr>
-              <w:t>SKELETON · points to per-chapter recovery</w:t>
+              <w:t>Ch1 AVAILABLE · Ch2–7 SKELETON</w:t>
             </w:r>
           </w:p>
         </w:tc>

</xml_diff>